<commit_message>
feat: add VivaResumeBanner component for reattaching to ongoing analyses
- Introduced VivaResumeBanner to display analysis progress after page reloads.
- Implemented inflight job management to persist analysis state across sessions.
- Enhanced VivaAnalyzeProgress to include mark_id for completed analyses.
- Updated scoreExplainers with new components and improved descriptions.
- Added API endpoints for managing student assignments to saved marks.
- Modified server logic to handle new student_id and subject_code fields.
- Updated Viva Marking Sheet to reflect changes in technical accuracy scoring.
- Added PDF version of the Viva Marking Sheet for examiner use.
</commit_message>
<xml_diff>
--- a/Viva_Marking_Sheet.docx
+++ b/Viva_Marking_Sheet.docx
@@ -5916,7 +5916,24 @@
           <w:sz w:val="20"/>
           <w:szCs w:val="20"/>
         </w:rPr>
-        <w:t xml:space="preserve">Use the concept rubric uploaded for this subject (list the concepts below, with the weight shown in the system). For each concept, mark how well the student’s answer covered it: 0 = not mentioned or wrong, 5 = partly correct, 10 = correct and clear. The technical mark is the weighted average (out of 10), the same way the system combines concepts.</w:t>
+        <w:t xml:space="preserve">Use the table for the subject of this recording. These are the same concepts and weights the system uses. For each concept, mark how well the student’s answer covered it: 0 = not mentioned or wrong, 5 = partly correct, 10 = correct and clear. The technical mark is the weighted average (out of 10), calculated the same way the system combines concepts.</w:t>
+      </w:r>
+    </w:p>
+    <w:p>
+      <w:pPr>
+        <w:pStyle w:val="Heading2"/>
+        <w:spacing w:after="80" w:before="160"/>
+      </w:pPr>
+      <w:r>
+        <w:rPr>
+          <w:rFonts w:ascii="Calibri" w:cs="Calibri" w:eastAsia="Calibri" w:hAnsi="Calibri"/>
+          <w:b/>
+          <w:bCs/>
+          <w:color w:val="1F3A5F"/>
+          <w:sz w:val="22"/>
+          <w:szCs w:val="22"/>
+        </w:rPr>
+        <w:t xml:space="preserve">SE1030: software enginerring (12 concepts)</w:t>
       </w:r>
     </w:p>
     <w:tbl>
@@ -6005,7 +6022,7 @@
                 <w:sz w:val="20"/>
                 <w:szCs w:val="20"/>
               </w:rPr>
-              <w:t xml:space="preserve">Concept (from the subject rubric)</w:t>
+              <w:t xml:space="preserve">Concept</w:t>
             </w:r>
           </w:p>
         </w:tc>
@@ -6170,7 +6187,7 @@
                 <w:sz w:val="20"/>
                 <w:szCs w:val="20"/>
               </w:rPr>
-              <w:t xml:space="preserve"/>
+              <w:t xml:space="preserve">Unit Testing</w:t>
             </w:r>
           </w:p>
         </w:tc>
@@ -6200,7 +6217,7 @@
                 <w:sz w:val="20"/>
                 <w:szCs w:val="20"/>
               </w:rPr>
-              <w:t xml:space="preserve">____</w:t>
+              <w:t xml:space="preserve">5</w:t>
             </w:r>
           </w:p>
         </w:tc>
@@ -6326,7 +6343,7 @@
                 <w:sz w:val="20"/>
                 <w:szCs w:val="20"/>
               </w:rPr>
-              <w:t xml:space="preserve"/>
+              <w:t xml:space="preserve">Integration Testing</w:t>
             </w:r>
           </w:p>
         </w:tc>
@@ -6356,7 +6373,7 @@
                 <w:sz w:val="20"/>
                 <w:szCs w:val="20"/>
               </w:rPr>
-              <w:t xml:space="preserve">____</w:t>
+              <w:t xml:space="preserve">5</w:t>
             </w:r>
           </w:p>
         </w:tc>
@@ -6482,7 +6499,7 @@
                 <w:sz w:val="20"/>
                 <w:szCs w:val="20"/>
               </w:rPr>
-              <w:t xml:space="preserve"/>
+              <w:t xml:space="preserve">System Testing</w:t>
             </w:r>
           </w:p>
         </w:tc>
@@ -6512,7 +6529,7 @@
                 <w:sz w:val="20"/>
                 <w:szCs w:val="20"/>
               </w:rPr>
-              <w:t xml:space="preserve">____</w:t>
+              <w:t xml:space="preserve">5</w:t>
             </w:r>
           </w:p>
         </w:tc>
@@ -6638,7 +6655,7 @@
                 <w:sz w:val="20"/>
                 <w:szCs w:val="20"/>
               </w:rPr>
-              <w:t xml:space="preserve"/>
+              <w:t xml:space="preserve">Performance Testing</w:t>
             </w:r>
           </w:p>
         </w:tc>
@@ -6668,7 +6685,7 @@
                 <w:sz w:val="20"/>
                 <w:szCs w:val="20"/>
               </w:rPr>
-              <w:t xml:space="preserve">____</w:t>
+              <w:t xml:space="preserve">4</w:t>
             </w:r>
           </w:p>
         </w:tc>
@@ -6794,7 +6811,7 @@
                 <w:sz w:val="20"/>
                 <w:szCs w:val="20"/>
               </w:rPr>
-              <w:t xml:space="preserve"/>
+              <w:t xml:space="preserve">Security Testing</w:t>
             </w:r>
           </w:p>
         </w:tc>
@@ -6824,7 +6841,7 @@
                 <w:sz w:val="20"/>
                 <w:szCs w:val="20"/>
               </w:rPr>
-              <w:t xml:space="preserve">____</w:t>
+              <w:t xml:space="preserve">4</w:t>
             </w:r>
           </w:p>
         </w:tc>
@@ -6950,7 +6967,7 @@
                 <w:sz w:val="20"/>
                 <w:szCs w:val="20"/>
               </w:rPr>
-              <w:t xml:space="preserve"/>
+              <w:t xml:space="preserve">Smoke Testing</w:t>
             </w:r>
           </w:p>
         </w:tc>
@@ -6980,7 +6997,7 @@
                 <w:sz w:val="20"/>
                 <w:szCs w:val="20"/>
               </w:rPr>
-              <w:t xml:space="preserve">____</w:t>
+              <w:t xml:space="preserve">3</w:t>
             </w:r>
           </w:p>
         </w:tc>
@@ -7106,7 +7123,7 @@
                 <w:sz w:val="20"/>
                 <w:szCs w:val="20"/>
               </w:rPr>
-              <w:t xml:space="preserve"/>
+              <w:t xml:space="preserve">Sanity Testing</w:t>
             </w:r>
           </w:p>
         </w:tc>
@@ -7136,7 +7153,7 @@
                 <w:sz w:val="20"/>
                 <w:szCs w:val="20"/>
               </w:rPr>
-              <w:t xml:space="preserve">____</w:t>
+              <w:t xml:space="preserve">3</w:t>
             </w:r>
           </w:p>
         </w:tc>
@@ -7262,7 +7279,7 @@
                 <w:sz w:val="20"/>
                 <w:szCs w:val="20"/>
               </w:rPr>
-              <w:t xml:space="preserve"/>
+              <w:t xml:space="preserve">Black-Box Testing</w:t>
             </w:r>
           </w:p>
         </w:tc>
@@ -7292,7 +7309,7 @@
                 <w:sz w:val="20"/>
                 <w:szCs w:val="20"/>
               </w:rPr>
-              <w:t xml:space="preserve">____</w:t>
+              <w:t xml:space="preserve">4</w:t>
             </w:r>
           </w:p>
         </w:tc>
@@ -7388,6 +7405,630 @@
                 <w:sz w:val="20"/>
                 <w:szCs w:val="20"/>
               </w:rPr>
+              <w:t xml:space="preserve">9</w:t>
+            </w:r>
+          </w:p>
+        </w:tc>
+        <w:tc>
+          <w:tcPr>
+            <w:tcW w:type="dxa" w:w="4766"/>
+            <w:tcBorders>
+              <w:top w:val="single" w:color="808080" w:sz="4"/>
+              <w:left w:val="single" w:color="808080" w:sz="4"/>
+              <w:bottom w:val="single" w:color="808080" w:sz="4"/>
+              <w:right w:val="single" w:color="808080" w:sz="4"/>
+            </w:tcBorders>
+            <w:tcMar>
+              <w:top w:type="dxa" w:w="60"/>
+              <w:left w:type="dxa" w:w="100"/>
+              <w:bottom w:type="dxa" w:w="60"/>
+              <w:right w:type="dxa" w:w="100"/>
+            </w:tcMar>
+          </w:tcPr>
+          <w:p>
+            <w:pPr>
+              <w:spacing w:after="40"/>
+            </w:pPr>
+            <w:r>
+              <w:rPr>
+                <w:rFonts w:ascii="Calibri" w:cs="Calibri" w:eastAsia="Calibri" w:hAnsi="Calibri"/>
+                <w:sz w:val="20"/>
+                <w:szCs w:val="20"/>
+              </w:rPr>
+              <w:t xml:space="preserve">White-Box Testing</w:t>
+            </w:r>
+          </w:p>
+        </w:tc>
+        <w:tc>
+          <w:tcPr>
+            <w:tcW w:type="dxa" w:w="1300"/>
+            <w:tcBorders>
+              <w:top w:val="single" w:color="808080" w:sz="4"/>
+              <w:left w:val="single" w:color="808080" w:sz="4"/>
+              <w:bottom w:val="single" w:color="808080" w:sz="4"/>
+              <w:right w:val="single" w:color="808080" w:sz="4"/>
+            </w:tcBorders>
+            <w:tcMar>
+              <w:top w:type="dxa" w:w="60"/>
+              <w:left w:type="dxa" w:w="100"/>
+              <w:bottom w:type="dxa" w:w="60"/>
+              <w:right w:type="dxa" w:w="100"/>
+            </w:tcMar>
+          </w:tcPr>
+          <w:p>
+            <w:pPr>
+              <w:spacing w:after="40"/>
+            </w:pPr>
+            <w:r>
+              <w:rPr>
+                <w:rFonts w:ascii="Calibri" w:cs="Calibri" w:eastAsia="Calibri" w:hAnsi="Calibri"/>
+                <w:sz w:val="20"/>
+                <w:szCs w:val="20"/>
+              </w:rPr>
+              <w:t xml:space="preserve">4</w:t>
+            </w:r>
+          </w:p>
+        </w:tc>
+        <w:tc>
+          <w:tcPr>
+            <w:tcW w:type="dxa" w:w="1700"/>
+            <w:tcBorders>
+              <w:top w:val="single" w:color="808080" w:sz="4"/>
+              <w:left w:val="single" w:color="808080" w:sz="4"/>
+              <w:bottom w:val="single" w:color="808080" w:sz="4"/>
+              <w:right w:val="single" w:color="808080" w:sz="4"/>
+            </w:tcBorders>
+            <w:tcMar>
+              <w:top w:type="dxa" w:w="60"/>
+              <w:left w:type="dxa" w:w="100"/>
+              <w:bottom w:type="dxa" w:w="60"/>
+              <w:right w:type="dxa" w:w="100"/>
+            </w:tcMar>
+          </w:tcPr>
+          <w:p>
+            <w:pPr>
+              <w:spacing w:after="40"/>
+            </w:pPr>
+            <w:r>
+              <w:rPr>
+                <w:rFonts w:ascii="Calibri" w:cs="Calibri" w:eastAsia="Calibri" w:hAnsi="Calibri"/>
+                <w:sz w:val="20"/>
+                <w:szCs w:val="20"/>
+              </w:rPr>
+              <w:t xml:space="preserve">____</w:t>
+            </w:r>
+          </w:p>
+        </w:tc>
+        <w:tc>
+          <w:tcPr>
+            <w:tcW w:type="dxa" w:w="2000"/>
+            <w:tcBorders>
+              <w:top w:val="single" w:color="808080" w:sz="4"/>
+              <w:left w:val="single" w:color="808080" w:sz="4"/>
+              <w:bottom w:val="single" w:color="808080" w:sz="4"/>
+              <w:right w:val="single" w:color="808080" w:sz="4"/>
+            </w:tcBorders>
+            <w:tcMar>
+              <w:top w:type="dxa" w:w="60"/>
+              <w:left w:type="dxa" w:w="100"/>
+              <w:bottom w:type="dxa" w:w="60"/>
+              <w:right w:type="dxa" w:w="100"/>
+            </w:tcMar>
+          </w:tcPr>
+          <w:p>
+            <w:pPr>
+              <w:spacing w:after="40"/>
+            </w:pPr>
+            <w:r>
+              <w:rPr>
+                <w:rFonts w:ascii="Calibri" w:cs="Calibri" w:eastAsia="Calibri" w:hAnsi="Calibri"/>
+                <w:sz w:val="20"/>
+                <w:szCs w:val="20"/>
+              </w:rPr>
+              <w:t xml:space="preserve">____</w:t>
+            </w:r>
+          </w:p>
+        </w:tc>
+      </w:tr>
+      <w:tr>
+        <w:trPr>
+          <w:cantSplit/>
+          <w:tblHeader w:val="off"/>
+        </w:trPr>
+        <w:tc>
+          <w:tcPr>
+            <w:tcW w:type="dxa" w:w="700"/>
+            <w:tcBorders>
+              <w:top w:val="single" w:color="808080" w:sz="4"/>
+              <w:left w:val="single" w:color="808080" w:sz="4"/>
+              <w:bottom w:val="single" w:color="808080" w:sz="4"/>
+              <w:right w:val="single" w:color="808080" w:sz="4"/>
+            </w:tcBorders>
+            <w:tcMar>
+              <w:top w:type="dxa" w:w="60"/>
+              <w:left w:type="dxa" w:w="100"/>
+              <w:bottom w:type="dxa" w:w="60"/>
+              <w:right w:type="dxa" w:w="100"/>
+            </w:tcMar>
+          </w:tcPr>
+          <w:p>
+            <w:pPr>
+              <w:spacing w:after="40"/>
+            </w:pPr>
+            <w:r>
+              <w:rPr>
+                <w:rFonts w:ascii="Calibri" w:cs="Calibri" w:eastAsia="Calibri" w:hAnsi="Calibri"/>
+                <w:sz w:val="20"/>
+                <w:szCs w:val="20"/>
+              </w:rPr>
+              <w:t xml:space="preserve">10</w:t>
+            </w:r>
+          </w:p>
+        </w:tc>
+        <w:tc>
+          <w:tcPr>
+            <w:tcW w:type="dxa" w:w="4766"/>
+            <w:tcBorders>
+              <w:top w:val="single" w:color="808080" w:sz="4"/>
+              <w:left w:val="single" w:color="808080" w:sz="4"/>
+              <w:bottom w:val="single" w:color="808080" w:sz="4"/>
+              <w:right w:val="single" w:color="808080" w:sz="4"/>
+            </w:tcBorders>
+            <w:tcMar>
+              <w:top w:type="dxa" w:w="60"/>
+              <w:left w:type="dxa" w:w="100"/>
+              <w:bottom w:type="dxa" w:w="60"/>
+              <w:right w:type="dxa" w:w="100"/>
+            </w:tcMar>
+          </w:tcPr>
+          <w:p>
+            <w:pPr>
+              <w:spacing w:after="40"/>
+            </w:pPr>
+            <w:r>
+              <w:rPr>
+                <w:rFonts w:ascii="Calibri" w:cs="Calibri" w:eastAsia="Calibri" w:hAnsi="Calibri"/>
+                <w:sz w:val="20"/>
+                <w:szCs w:val="20"/>
+              </w:rPr>
+              <w:t xml:space="preserve">Equivalence Partitioning</w:t>
+            </w:r>
+          </w:p>
+        </w:tc>
+        <w:tc>
+          <w:tcPr>
+            <w:tcW w:type="dxa" w:w="1300"/>
+            <w:tcBorders>
+              <w:top w:val="single" w:color="808080" w:sz="4"/>
+              <w:left w:val="single" w:color="808080" w:sz="4"/>
+              <w:bottom w:val="single" w:color="808080" w:sz="4"/>
+              <w:right w:val="single" w:color="808080" w:sz="4"/>
+            </w:tcBorders>
+            <w:tcMar>
+              <w:top w:type="dxa" w:w="60"/>
+              <w:left w:type="dxa" w:w="100"/>
+              <w:bottom w:type="dxa" w:w="60"/>
+              <w:right w:type="dxa" w:w="100"/>
+            </w:tcMar>
+          </w:tcPr>
+          <w:p>
+            <w:pPr>
+              <w:spacing w:after="40"/>
+            </w:pPr>
+            <w:r>
+              <w:rPr>
+                <w:rFonts w:ascii="Calibri" w:cs="Calibri" w:eastAsia="Calibri" w:hAnsi="Calibri"/>
+                <w:sz w:val="20"/>
+                <w:szCs w:val="20"/>
+              </w:rPr>
+              <w:t xml:space="preserve">3</w:t>
+            </w:r>
+          </w:p>
+        </w:tc>
+        <w:tc>
+          <w:tcPr>
+            <w:tcW w:type="dxa" w:w="1700"/>
+            <w:tcBorders>
+              <w:top w:val="single" w:color="808080" w:sz="4"/>
+              <w:left w:val="single" w:color="808080" w:sz="4"/>
+              <w:bottom w:val="single" w:color="808080" w:sz="4"/>
+              <w:right w:val="single" w:color="808080" w:sz="4"/>
+            </w:tcBorders>
+            <w:tcMar>
+              <w:top w:type="dxa" w:w="60"/>
+              <w:left w:type="dxa" w:w="100"/>
+              <w:bottom w:type="dxa" w:w="60"/>
+              <w:right w:type="dxa" w:w="100"/>
+            </w:tcMar>
+          </w:tcPr>
+          <w:p>
+            <w:pPr>
+              <w:spacing w:after="40"/>
+            </w:pPr>
+            <w:r>
+              <w:rPr>
+                <w:rFonts w:ascii="Calibri" w:cs="Calibri" w:eastAsia="Calibri" w:hAnsi="Calibri"/>
+                <w:sz w:val="20"/>
+                <w:szCs w:val="20"/>
+              </w:rPr>
+              <w:t xml:space="preserve">____</w:t>
+            </w:r>
+          </w:p>
+        </w:tc>
+        <w:tc>
+          <w:tcPr>
+            <w:tcW w:type="dxa" w:w="2000"/>
+            <w:tcBorders>
+              <w:top w:val="single" w:color="808080" w:sz="4"/>
+              <w:left w:val="single" w:color="808080" w:sz="4"/>
+              <w:bottom w:val="single" w:color="808080" w:sz="4"/>
+              <w:right w:val="single" w:color="808080" w:sz="4"/>
+            </w:tcBorders>
+            <w:tcMar>
+              <w:top w:type="dxa" w:w="60"/>
+              <w:left w:type="dxa" w:w="100"/>
+              <w:bottom w:type="dxa" w:w="60"/>
+              <w:right w:type="dxa" w:w="100"/>
+            </w:tcMar>
+          </w:tcPr>
+          <w:p>
+            <w:pPr>
+              <w:spacing w:after="40"/>
+            </w:pPr>
+            <w:r>
+              <w:rPr>
+                <w:rFonts w:ascii="Calibri" w:cs="Calibri" w:eastAsia="Calibri" w:hAnsi="Calibri"/>
+                <w:sz w:val="20"/>
+                <w:szCs w:val="20"/>
+              </w:rPr>
+              <w:t xml:space="preserve">____</w:t>
+            </w:r>
+          </w:p>
+        </w:tc>
+      </w:tr>
+      <w:tr>
+        <w:trPr>
+          <w:cantSplit/>
+          <w:tblHeader w:val="off"/>
+        </w:trPr>
+        <w:tc>
+          <w:tcPr>
+            <w:tcW w:type="dxa" w:w="700"/>
+            <w:tcBorders>
+              <w:top w:val="single" w:color="808080" w:sz="4"/>
+              <w:left w:val="single" w:color="808080" w:sz="4"/>
+              <w:bottom w:val="single" w:color="808080" w:sz="4"/>
+              <w:right w:val="single" w:color="808080" w:sz="4"/>
+            </w:tcBorders>
+            <w:tcMar>
+              <w:top w:type="dxa" w:w="60"/>
+              <w:left w:type="dxa" w:w="100"/>
+              <w:bottom w:type="dxa" w:w="60"/>
+              <w:right w:type="dxa" w:w="100"/>
+            </w:tcMar>
+          </w:tcPr>
+          <w:p>
+            <w:pPr>
+              <w:spacing w:after="40"/>
+            </w:pPr>
+            <w:r>
+              <w:rPr>
+                <w:rFonts w:ascii="Calibri" w:cs="Calibri" w:eastAsia="Calibri" w:hAnsi="Calibri"/>
+                <w:sz w:val="20"/>
+                <w:szCs w:val="20"/>
+              </w:rPr>
+              <w:t xml:space="preserve">11</w:t>
+            </w:r>
+          </w:p>
+        </w:tc>
+        <w:tc>
+          <w:tcPr>
+            <w:tcW w:type="dxa" w:w="4766"/>
+            <w:tcBorders>
+              <w:top w:val="single" w:color="808080" w:sz="4"/>
+              <w:left w:val="single" w:color="808080" w:sz="4"/>
+              <w:bottom w:val="single" w:color="808080" w:sz="4"/>
+              <w:right w:val="single" w:color="808080" w:sz="4"/>
+            </w:tcBorders>
+            <w:tcMar>
+              <w:top w:type="dxa" w:w="60"/>
+              <w:left w:type="dxa" w:w="100"/>
+              <w:bottom w:type="dxa" w:w="60"/>
+              <w:right w:type="dxa" w:w="100"/>
+            </w:tcMar>
+          </w:tcPr>
+          <w:p>
+            <w:pPr>
+              <w:spacing w:after="40"/>
+            </w:pPr>
+            <w:r>
+              <w:rPr>
+                <w:rFonts w:ascii="Calibri" w:cs="Calibri" w:eastAsia="Calibri" w:hAnsi="Calibri"/>
+                <w:sz w:val="20"/>
+                <w:szCs w:val="20"/>
+              </w:rPr>
+              <w:t xml:space="preserve">Boundary Value Analysis</w:t>
+            </w:r>
+          </w:p>
+        </w:tc>
+        <w:tc>
+          <w:tcPr>
+            <w:tcW w:type="dxa" w:w="1300"/>
+            <w:tcBorders>
+              <w:top w:val="single" w:color="808080" w:sz="4"/>
+              <w:left w:val="single" w:color="808080" w:sz="4"/>
+              <w:bottom w:val="single" w:color="808080" w:sz="4"/>
+              <w:right w:val="single" w:color="808080" w:sz="4"/>
+            </w:tcBorders>
+            <w:tcMar>
+              <w:top w:type="dxa" w:w="60"/>
+              <w:left w:type="dxa" w:w="100"/>
+              <w:bottom w:type="dxa" w:w="60"/>
+              <w:right w:type="dxa" w:w="100"/>
+            </w:tcMar>
+          </w:tcPr>
+          <w:p>
+            <w:pPr>
+              <w:spacing w:after="40"/>
+            </w:pPr>
+            <w:r>
+              <w:rPr>
+                <w:rFonts w:ascii="Calibri" w:cs="Calibri" w:eastAsia="Calibri" w:hAnsi="Calibri"/>
+                <w:sz w:val="20"/>
+                <w:szCs w:val="20"/>
+              </w:rPr>
+              <w:t xml:space="preserve">3</w:t>
+            </w:r>
+          </w:p>
+        </w:tc>
+        <w:tc>
+          <w:tcPr>
+            <w:tcW w:type="dxa" w:w="1700"/>
+            <w:tcBorders>
+              <w:top w:val="single" w:color="808080" w:sz="4"/>
+              <w:left w:val="single" w:color="808080" w:sz="4"/>
+              <w:bottom w:val="single" w:color="808080" w:sz="4"/>
+              <w:right w:val="single" w:color="808080" w:sz="4"/>
+            </w:tcBorders>
+            <w:tcMar>
+              <w:top w:type="dxa" w:w="60"/>
+              <w:left w:type="dxa" w:w="100"/>
+              <w:bottom w:type="dxa" w:w="60"/>
+              <w:right w:type="dxa" w:w="100"/>
+            </w:tcMar>
+          </w:tcPr>
+          <w:p>
+            <w:pPr>
+              <w:spacing w:after="40"/>
+            </w:pPr>
+            <w:r>
+              <w:rPr>
+                <w:rFonts w:ascii="Calibri" w:cs="Calibri" w:eastAsia="Calibri" w:hAnsi="Calibri"/>
+                <w:sz w:val="20"/>
+                <w:szCs w:val="20"/>
+              </w:rPr>
+              <w:t xml:space="preserve">____</w:t>
+            </w:r>
+          </w:p>
+        </w:tc>
+        <w:tc>
+          <w:tcPr>
+            <w:tcW w:type="dxa" w:w="2000"/>
+            <w:tcBorders>
+              <w:top w:val="single" w:color="808080" w:sz="4"/>
+              <w:left w:val="single" w:color="808080" w:sz="4"/>
+              <w:bottom w:val="single" w:color="808080" w:sz="4"/>
+              <w:right w:val="single" w:color="808080" w:sz="4"/>
+            </w:tcBorders>
+            <w:tcMar>
+              <w:top w:type="dxa" w:w="60"/>
+              <w:left w:type="dxa" w:w="100"/>
+              <w:bottom w:type="dxa" w:w="60"/>
+              <w:right w:type="dxa" w:w="100"/>
+            </w:tcMar>
+          </w:tcPr>
+          <w:p>
+            <w:pPr>
+              <w:spacing w:after="40"/>
+            </w:pPr>
+            <w:r>
+              <w:rPr>
+                <w:rFonts w:ascii="Calibri" w:cs="Calibri" w:eastAsia="Calibri" w:hAnsi="Calibri"/>
+                <w:sz w:val="20"/>
+                <w:szCs w:val="20"/>
+              </w:rPr>
+              <w:t xml:space="preserve">____</w:t>
+            </w:r>
+          </w:p>
+        </w:tc>
+      </w:tr>
+      <w:tr>
+        <w:trPr>
+          <w:cantSplit/>
+          <w:tblHeader w:val="off"/>
+        </w:trPr>
+        <w:tc>
+          <w:tcPr>
+            <w:tcW w:type="dxa" w:w="700"/>
+            <w:tcBorders>
+              <w:top w:val="single" w:color="808080" w:sz="4"/>
+              <w:left w:val="single" w:color="808080" w:sz="4"/>
+              <w:bottom w:val="single" w:color="808080" w:sz="4"/>
+              <w:right w:val="single" w:color="808080" w:sz="4"/>
+            </w:tcBorders>
+            <w:tcMar>
+              <w:top w:type="dxa" w:w="60"/>
+              <w:left w:type="dxa" w:w="100"/>
+              <w:bottom w:type="dxa" w:w="60"/>
+              <w:right w:type="dxa" w:w="100"/>
+            </w:tcMar>
+          </w:tcPr>
+          <w:p>
+            <w:pPr>
+              <w:spacing w:after="40"/>
+            </w:pPr>
+            <w:r>
+              <w:rPr>
+                <w:rFonts w:ascii="Calibri" w:cs="Calibri" w:eastAsia="Calibri" w:hAnsi="Calibri"/>
+                <w:sz w:val="20"/>
+                <w:szCs w:val="20"/>
+              </w:rPr>
+              <w:t xml:space="preserve">12</w:t>
+            </w:r>
+          </w:p>
+        </w:tc>
+        <w:tc>
+          <w:tcPr>
+            <w:tcW w:type="dxa" w:w="4766"/>
+            <w:tcBorders>
+              <w:top w:val="single" w:color="808080" w:sz="4"/>
+              <w:left w:val="single" w:color="808080" w:sz="4"/>
+              <w:bottom w:val="single" w:color="808080" w:sz="4"/>
+              <w:right w:val="single" w:color="808080" w:sz="4"/>
+            </w:tcBorders>
+            <w:tcMar>
+              <w:top w:type="dxa" w:w="60"/>
+              <w:left w:type="dxa" w:w="100"/>
+              <w:bottom w:type="dxa" w:w="60"/>
+              <w:right w:type="dxa" w:w="100"/>
+            </w:tcMar>
+          </w:tcPr>
+          <w:p>
+            <w:pPr>
+              <w:spacing w:after="40"/>
+            </w:pPr>
+            <w:r>
+              <w:rPr>
+                <w:rFonts w:ascii="Calibri" w:cs="Calibri" w:eastAsia="Calibri" w:hAnsi="Calibri"/>
+                <w:sz w:val="20"/>
+                <w:szCs w:val="20"/>
+              </w:rPr>
+              <w:t xml:space="preserve">Regression Testing</w:t>
+            </w:r>
+          </w:p>
+        </w:tc>
+        <w:tc>
+          <w:tcPr>
+            <w:tcW w:type="dxa" w:w="1300"/>
+            <w:tcBorders>
+              <w:top w:val="single" w:color="808080" w:sz="4"/>
+              <w:left w:val="single" w:color="808080" w:sz="4"/>
+              <w:bottom w:val="single" w:color="808080" w:sz="4"/>
+              <w:right w:val="single" w:color="808080" w:sz="4"/>
+            </w:tcBorders>
+            <w:tcMar>
+              <w:top w:type="dxa" w:w="60"/>
+              <w:left w:type="dxa" w:w="100"/>
+              <w:bottom w:type="dxa" w:w="60"/>
+              <w:right w:type="dxa" w:w="100"/>
+            </w:tcMar>
+          </w:tcPr>
+          <w:p>
+            <w:pPr>
+              <w:spacing w:after="40"/>
+            </w:pPr>
+            <w:r>
+              <w:rPr>
+                <w:rFonts w:ascii="Calibri" w:cs="Calibri" w:eastAsia="Calibri" w:hAnsi="Calibri"/>
+                <w:sz w:val="20"/>
+                <w:szCs w:val="20"/>
+              </w:rPr>
+              <w:t xml:space="preserve">4</w:t>
+            </w:r>
+          </w:p>
+        </w:tc>
+        <w:tc>
+          <w:tcPr>
+            <w:tcW w:type="dxa" w:w="1700"/>
+            <w:tcBorders>
+              <w:top w:val="single" w:color="808080" w:sz="4"/>
+              <w:left w:val="single" w:color="808080" w:sz="4"/>
+              <w:bottom w:val="single" w:color="808080" w:sz="4"/>
+              <w:right w:val="single" w:color="808080" w:sz="4"/>
+            </w:tcBorders>
+            <w:tcMar>
+              <w:top w:type="dxa" w:w="60"/>
+              <w:left w:type="dxa" w:w="100"/>
+              <w:bottom w:type="dxa" w:w="60"/>
+              <w:right w:type="dxa" w:w="100"/>
+            </w:tcMar>
+          </w:tcPr>
+          <w:p>
+            <w:pPr>
+              <w:spacing w:after="40"/>
+            </w:pPr>
+            <w:r>
+              <w:rPr>
+                <w:rFonts w:ascii="Calibri" w:cs="Calibri" w:eastAsia="Calibri" w:hAnsi="Calibri"/>
+                <w:sz w:val="20"/>
+                <w:szCs w:val="20"/>
+              </w:rPr>
+              <w:t xml:space="preserve">____</w:t>
+            </w:r>
+          </w:p>
+        </w:tc>
+        <w:tc>
+          <w:tcPr>
+            <w:tcW w:type="dxa" w:w="2000"/>
+            <w:tcBorders>
+              <w:top w:val="single" w:color="808080" w:sz="4"/>
+              <w:left w:val="single" w:color="808080" w:sz="4"/>
+              <w:bottom w:val="single" w:color="808080" w:sz="4"/>
+              <w:right w:val="single" w:color="808080" w:sz="4"/>
+            </w:tcBorders>
+            <w:tcMar>
+              <w:top w:type="dxa" w:w="60"/>
+              <w:left w:type="dxa" w:w="100"/>
+              <w:bottom w:type="dxa" w:w="60"/>
+              <w:right w:type="dxa" w:w="100"/>
+            </w:tcMar>
+          </w:tcPr>
+          <w:p>
+            <w:pPr>
+              <w:spacing w:after="40"/>
+            </w:pPr>
+            <w:r>
+              <w:rPr>
+                <w:rFonts w:ascii="Calibri" w:cs="Calibri" w:eastAsia="Calibri" w:hAnsi="Calibri"/>
+                <w:sz w:val="20"/>
+                <w:szCs w:val="20"/>
+              </w:rPr>
+              <w:t xml:space="preserve">____</w:t>
+            </w:r>
+          </w:p>
+        </w:tc>
+      </w:tr>
+      <w:tr>
+        <w:trPr>
+          <w:cantSplit/>
+          <w:tblHeader w:val="off"/>
+        </w:trPr>
+        <w:tc>
+          <w:tcPr>
+            <w:tcW w:type="dxa" w:w="700"/>
+            <w:tcBorders>
+              <w:top w:val="single" w:color="808080" w:sz="4"/>
+              <w:left w:val="single" w:color="808080" w:sz="4"/>
+              <w:bottom w:val="single" w:color="808080" w:sz="4"/>
+              <w:right w:val="single" w:color="808080" w:sz="4"/>
+            </w:tcBorders>
+            <w:tcMar>
+              <w:top w:type="dxa" w:w="60"/>
+              <w:left w:type="dxa" w:w="100"/>
+              <w:bottom w:type="dxa" w:w="60"/>
+              <w:right w:type="dxa" w:w="100"/>
+            </w:tcMar>
+          </w:tcPr>
+          <w:p>
+            <w:pPr>
+              <w:spacing w:after="40"/>
+            </w:pPr>
+            <w:r>
+              <w:rPr>
+                <w:rFonts w:ascii="Calibri" w:cs="Calibri" w:eastAsia="Calibri" w:hAnsi="Calibri"/>
+                <w:sz w:val="20"/>
+                <w:szCs w:val="20"/>
+              </w:rPr>
               <w:t xml:space="preserve"/>
             </w:r>
           </w:p>
@@ -7450,7 +8091,7 @@
                 <w:sz w:val="20"/>
                 <w:szCs w:val="20"/>
               </w:rPr>
-              <w:t xml:space="preserve">W = ____</w:t>
+              <w:t xml:space="preserve">W = 47</w:t>
             </w:r>
           </w:p>
         </w:tc>
@@ -7518,7 +8159,7 @@
     </w:tbl>
     <w:p>
       <w:pPr>
-        <w:spacing w:before="100"/>
+        <w:spacing w:after="200" w:before="100"/>
       </w:pPr>
       <w:r>
         <w:rPr>
@@ -7528,7 +8169,2728 @@
           <w:sz w:val="20"/>
           <w:szCs w:val="20"/>
         </w:rPr>
-        <w:t xml:space="preserve">Technical mark /10 = S ÷ W = ________</w:t>
+        <w:t xml:space="preserve">Technical mark /10 = S ÷ 47 = ________</w:t>
+      </w:r>
+    </w:p>
+    <w:p>
+      <w:pPr>
+        <w:pStyle w:val="Heading2"/>
+        <w:spacing w:after="80" w:before="160"/>
+      </w:pPr>
+      <w:r>
+        <w:rPr>
+          <w:rFonts w:ascii="Calibri" w:cs="Calibri" w:eastAsia="Calibri" w:hAnsi="Calibri"/>
+          <w:b/>
+          <w:bCs/>
+          <w:color w:val="1F3A5F"/>
+          <w:sz w:val="22"/>
+          <w:szCs w:val="22"/>
+        </w:rPr>
+        <w:t xml:space="preserve">DS1030: DATABASE SYSTEM (15 concepts)</w:t>
+      </w:r>
+    </w:p>
+    <w:tbl>
+      <w:tblPr>
+        <w:tblW w:type="dxa" w:w="10466"/>
+        <w:tblBorders>
+          <w:top w:val="single" w:color="auto" w:sz="4"/>
+          <w:left w:val="single" w:color="auto" w:sz="4"/>
+          <w:bottom w:val="single" w:color="auto" w:sz="4"/>
+          <w:right w:val="single" w:color="auto" w:sz="4"/>
+          <w:insideH w:val="single" w:color="auto" w:sz="4"/>
+          <w:insideV w:val="single" w:color="auto" w:sz="4"/>
+        </w:tblBorders>
+      </w:tblPr>
+      <w:tblGrid>
+        <w:gridCol w:w="700"/>
+        <w:gridCol w:w="4766"/>
+        <w:gridCol w:w="1300"/>
+        <w:gridCol w:w="1700"/>
+        <w:gridCol w:w="2000"/>
+      </w:tblGrid>
+      <w:tr>
+        <w:trPr>
+          <w:cantSplit/>
+          <w:tblHeader/>
+        </w:trPr>
+        <w:tc>
+          <w:tcPr>
+            <w:tcW w:type="dxa" w:w="700"/>
+            <w:tcBorders>
+              <w:top w:val="single" w:color="808080" w:sz="4"/>
+              <w:left w:val="single" w:color="808080" w:sz="4"/>
+              <w:bottom w:val="single" w:color="808080" w:sz="4"/>
+              <w:right w:val="single" w:color="808080" w:sz="4"/>
+            </w:tcBorders>
+            <w:shd w:fill="D9E2F3" w:color="auto" w:val="clear"/>
+            <w:tcMar>
+              <w:top w:type="dxa" w:w="60"/>
+              <w:left w:type="dxa" w:w="100"/>
+              <w:bottom w:type="dxa" w:w="60"/>
+              <w:right w:type="dxa" w:w="100"/>
+            </w:tcMar>
+          </w:tcPr>
+          <w:p>
+            <w:pPr>
+              <w:spacing w:after="40"/>
+            </w:pPr>
+            <w:r>
+              <w:rPr>
+                <w:rFonts w:ascii="Calibri" w:cs="Calibri" w:eastAsia="Calibri" w:hAnsi="Calibri"/>
+                <w:b/>
+                <w:bCs/>
+                <w:sz w:val="20"/>
+                <w:szCs w:val="20"/>
+              </w:rPr>
+              <w:t xml:space="preserve">No.</w:t>
+            </w:r>
+          </w:p>
+        </w:tc>
+        <w:tc>
+          <w:tcPr>
+            <w:tcW w:type="dxa" w:w="4766"/>
+            <w:tcBorders>
+              <w:top w:val="single" w:color="808080" w:sz="4"/>
+              <w:left w:val="single" w:color="808080" w:sz="4"/>
+              <w:bottom w:val="single" w:color="808080" w:sz="4"/>
+              <w:right w:val="single" w:color="808080" w:sz="4"/>
+            </w:tcBorders>
+            <w:shd w:fill="D9E2F3" w:color="auto" w:val="clear"/>
+            <w:tcMar>
+              <w:top w:type="dxa" w:w="60"/>
+              <w:left w:type="dxa" w:w="100"/>
+              <w:bottom w:type="dxa" w:w="60"/>
+              <w:right w:type="dxa" w:w="100"/>
+            </w:tcMar>
+          </w:tcPr>
+          <w:p>
+            <w:pPr>
+              <w:spacing w:after="40"/>
+            </w:pPr>
+            <w:r>
+              <w:rPr>
+                <w:rFonts w:ascii="Calibri" w:cs="Calibri" w:eastAsia="Calibri" w:hAnsi="Calibri"/>
+                <w:b/>
+                <w:bCs/>
+                <w:sz w:val="20"/>
+                <w:szCs w:val="20"/>
+              </w:rPr>
+              <w:t xml:space="preserve">Concept</w:t>
+            </w:r>
+          </w:p>
+        </w:tc>
+        <w:tc>
+          <w:tcPr>
+            <w:tcW w:type="dxa" w:w="1300"/>
+            <w:tcBorders>
+              <w:top w:val="single" w:color="808080" w:sz="4"/>
+              <w:left w:val="single" w:color="808080" w:sz="4"/>
+              <w:bottom w:val="single" w:color="808080" w:sz="4"/>
+              <w:right w:val="single" w:color="808080" w:sz="4"/>
+            </w:tcBorders>
+            <w:shd w:fill="D9E2F3" w:color="auto" w:val="clear"/>
+            <w:tcMar>
+              <w:top w:type="dxa" w:w="60"/>
+              <w:left w:type="dxa" w:w="100"/>
+              <w:bottom w:type="dxa" w:w="60"/>
+              <w:right w:type="dxa" w:w="100"/>
+            </w:tcMar>
+          </w:tcPr>
+          <w:p>
+            <w:pPr>
+              <w:spacing w:after="40"/>
+            </w:pPr>
+            <w:r>
+              <w:rPr>
+                <w:rFonts w:ascii="Calibri" w:cs="Calibri" w:eastAsia="Calibri" w:hAnsi="Calibri"/>
+                <w:b/>
+                <w:bCs/>
+                <w:sz w:val="20"/>
+                <w:szCs w:val="20"/>
+              </w:rPr>
+              <w:t xml:space="preserve">Weight</w:t>
+            </w:r>
+          </w:p>
+        </w:tc>
+        <w:tc>
+          <w:tcPr>
+            <w:tcW w:type="dxa" w:w="1700"/>
+            <w:tcBorders>
+              <w:top w:val="single" w:color="808080" w:sz="4"/>
+              <w:left w:val="single" w:color="808080" w:sz="4"/>
+              <w:bottom w:val="single" w:color="808080" w:sz="4"/>
+              <w:right w:val="single" w:color="808080" w:sz="4"/>
+            </w:tcBorders>
+            <w:shd w:fill="D9E2F3" w:color="auto" w:val="clear"/>
+            <w:tcMar>
+              <w:top w:type="dxa" w:w="60"/>
+              <w:left w:type="dxa" w:w="100"/>
+              <w:bottom w:type="dxa" w:w="60"/>
+              <w:right w:type="dxa" w:w="100"/>
+            </w:tcMar>
+          </w:tcPr>
+          <w:p>
+            <w:pPr>
+              <w:spacing w:after="40"/>
+            </w:pPr>
+            <w:r>
+              <w:rPr>
+                <w:rFonts w:ascii="Calibri" w:cs="Calibri" w:eastAsia="Calibri" w:hAnsi="Calibri"/>
+                <w:b/>
+                <w:bCs/>
+                <w:sz w:val="20"/>
+                <w:szCs w:val="20"/>
+              </w:rPr>
+              <w:t xml:space="preserve">Score 0–10</w:t>
+            </w:r>
+          </w:p>
+        </w:tc>
+        <w:tc>
+          <w:tcPr>
+            <w:tcW w:type="dxa" w:w="2000"/>
+            <w:tcBorders>
+              <w:top w:val="single" w:color="808080" w:sz="4"/>
+              <w:left w:val="single" w:color="808080" w:sz="4"/>
+              <w:bottom w:val="single" w:color="808080" w:sz="4"/>
+              <w:right w:val="single" w:color="808080" w:sz="4"/>
+            </w:tcBorders>
+            <w:shd w:fill="D9E2F3" w:color="auto" w:val="clear"/>
+            <w:tcMar>
+              <w:top w:type="dxa" w:w="60"/>
+              <w:left w:type="dxa" w:w="100"/>
+              <w:bottom w:type="dxa" w:w="60"/>
+              <w:right w:type="dxa" w:w="100"/>
+            </w:tcMar>
+          </w:tcPr>
+          <w:p>
+            <w:pPr>
+              <w:spacing w:after="40"/>
+            </w:pPr>
+            <w:r>
+              <w:rPr>
+                <w:rFonts w:ascii="Calibri" w:cs="Calibri" w:eastAsia="Calibri" w:hAnsi="Calibri"/>
+                <w:b/>
+                <w:bCs/>
+                <w:sz w:val="20"/>
+                <w:szCs w:val="20"/>
+              </w:rPr>
+              <w:t xml:space="preserve">Weight × score</w:t>
+            </w:r>
+          </w:p>
+        </w:tc>
+      </w:tr>
+      <w:tr>
+        <w:trPr>
+          <w:cantSplit/>
+          <w:tblHeader w:val="off"/>
+        </w:trPr>
+        <w:tc>
+          <w:tcPr>
+            <w:tcW w:type="dxa" w:w="700"/>
+            <w:tcBorders>
+              <w:top w:val="single" w:color="808080" w:sz="4"/>
+              <w:left w:val="single" w:color="808080" w:sz="4"/>
+              <w:bottom w:val="single" w:color="808080" w:sz="4"/>
+              <w:right w:val="single" w:color="808080" w:sz="4"/>
+            </w:tcBorders>
+            <w:tcMar>
+              <w:top w:type="dxa" w:w="60"/>
+              <w:left w:type="dxa" w:w="100"/>
+              <w:bottom w:type="dxa" w:w="60"/>
+              <w:right w:type="dxa" w:w="100"/>
+            </w:tcMar>
+          </w:tcPr>
+          <w:p>
+            <w:pPr>
+              <w:spacing w:after="40"/>
+            </w:pPr>
+            <w:r>
+              <w:rPr>
+                <w:rFonts w:ascii="Calibri" w:cs="Calibri" w:eastAsia="Calibri" w:hAnsi="Calibri"/>
+                <w:sz w:val="20"/>
+                <w:szCs w:val="20"/>
+              </w:rPr>
+              <w:t xml:space="preserve">1</w:t>
+            </w:r>
+          </w:p>
+        </w:tc>
+        <w:tc>
+          <w:tcPr>
+            <w:tcW w:type="dxa" w:w="4766"/>
+            <w:tcBorders>
+              <w:top w:val="single" w:color="808080" w:sz="4"/>
+              <w:left w:val="single" w:color="808080" w:sz="4"/>
+              <w:bottom w:val="single" w:color="808080" w:sz="4"/>
+              <w:right w:val="single" w:color="808080" w:sz="4"/>
+            </w:tcBorders>
+            <w:tcMar>
+              <w:top w:type="dxa" w:w="60"/>
+              <w:left w:type="dxa" w:w="100"/>
+              <w:bottom w:type="dxa" w:w="60"/>
+              <w:right w:type="dxa" w:w="100"/>
+            </w:tcMar>
+          </w:tcPr>
+          <w:p>
+            <w:pPr>
+              <w:spacing w:after="40"/>
+            </w:pPr>
+            <w:r>
+              <w:rPr>
+                <w:rFonts w:ascii="Calibri" w:cs="Calibri" w:eastAsia="Calibri" w:hAnsi="Calibri"/>
+                <w:sz w:val="20"/>
+                <w:szCs w:val="20"/>
+              </w:rPr>
+              <w:t xml:space="preserve">Entity</w:t>
+            </w:r>
+          </w:p>
+        </w:tc>
+        <w:tc>
+          <w:tcPr>
+            <w:tcW w:type="dxa" w:w="1300"/>
+            <w:tcBorders>
+              <w:top w:val="single" w:color="808080" w:sz="4"/>
+              <w:left w:val="single" w:color="808080" w:sz="4"/>
+              <w:bottom w:val="single" w:color="808080" w:sz="4"/>
+              <w:right w:val="single" w:color="808080" w:sz="4"/>
+            </w:tcBorders>
+            <w:tcMar>
+              <w:top w:type="dxa" w:w="60"/>
+              <w:left w:type="dxa" w:w="100"/>
+              <w:bottom w:type="dxa" w:w="60"/>
+              <w:right w:type="dxa" w:w="100"/>
+            </w:tcMar>
+          </w:tcPr>
+          <w:p>
+            <w:pPr>
+              <w:spacing w:after="40"/>
+            </w:pPr>
+            <w:r>
+              <w:rPr>
+                <w:rFonts w:ascii="Calibri" w:cs="Calibri" w:eastAsia="Calibri" w:hAnsi="Calibri"/>
+                <w:sz w:val="20"/>
+                <w:szCs w:val="20"/>
+              </w:rPr>
+              <w:t xml:space="preserve">5</w:t>
+            </w:r>
+          </w:p>
+        </w:tc>
+        <w:tc>
+          <w:tcPr>
+            <w:tcW w:type="dxa" w:w="1700"/>
+            <w:tcBorders>
+              <w:top w:val="single" w:color="808080" w:sz="4"/>
+              <w:left w:val="single" w:color="808080" w:sz="4"/>
+              <w:bottom w:val="single" w:color="808080" w:sz="4"/>
+              <w:right w:val="single" w:color="808080" w:sz="4"/>
+            </w:tcBorders>
+            <w:tcMar>
+              <w:top w:type="dxa" w:w="60"/>
+              <w:left w:type="dxa" w:w="100"/>
+              <w:bottom w:type="dxa" w:w="60"/>
+              <w:right w:type="dxa" w:w="100"/>
+            </w:tcMar>
+          </w:tcPr>
+          <w:p>
+            <w:pPr>
+              <w:spacing w:after="40"/>
+            </w:pPr>
+            <w:r>
+              <w:rPr>
+                <w:rFonts w:ascii="Calibri" w:cs="Calibri" w:eastAsia="Calibri" w:hAnsi="Calibri"/>
+                <w:sz w:val="20"/>
+                <w:szCs w:val="20"/>
+              </w:rPr>
+              <w:t xml:space="preserve">____</w:t>
+            </w:r>
+          </w:p>
+        </w:tc>
+        <w:tc>
+          <w:tcPr>
+            <w:tcW w:type="dxa" w:w="2000"/>
+            <w:tcBorders>
+              <w:top w:val="single" w:color="808080" w:sz="4"/>
+              <w:left w:val="single" w:color="808080" w:sz="4"/>
+              <w:bottom w:val="single" w:color="808080" w:sz="4"/>
+              <w:right w:val="single" w:color="808080" w:sz="4"/>
+            </w:tcBorders>
+            <w:tcMar>
+              <w:top w:type="dxa" w:w="60"/>
+              <w:left w:type="dxa" w:w="100"/>
+              <w:bottom w:type="dxa" w:w="60"/>
+              <w:right w:type="dxa" w:w="100"/>
+            </w:tcMar>
+          </w:tcPr>
+          <w:p>
+            <w:pPr>
+              <w:spacing w:after="40"/>
+            </w:pPr>
+            <w:r>
+              <w:rPr>
+                <w:rFonts w:ascii="Calibri" w:cs="Calibri" w:eastAsia="Calibri" w:hAnsi="Calibri"/>
+                <w:sz w:val="20"/>
+                <w:szCs w:val="20"/>
+              </w:rPr>
+              <w:t xml:space="preserve">____</w:t>
+            </w:r>
+          </w:p>
+        </w:tc>
+      </w:tr>
+      <w:tr>
+        <w:trPr>
+          <w:cantSplit/>
+          <w:tblHeader w:val="off"/>
+        </w:trPr>
+        <w:tc>
+          <w:tcPr>
+            <w:tcW w:type="dxa" w:w="700"/>
+            <w:tcBorders>
+              <w:top w:val="single" w:color="808080" w:sz="4"/>
+              <w:left w:val="single" w:color="808080" w:sz="4"/>
+              <w:bottom w:val="single" w:color="808080" w:sz="4"/>
+              <w:right w:val="single" w:color="808080" w:sz="4"/>
+            </w:tcBorders>
+            <w:tcMar>
+              <w:top w:type="dxa" w:w="60"/>
+              <w:left w:type="dxa" w:w="100"/>
+              <w:bottom w:type="dxa" w:w="60"/>
+              <w:right w:type="dxa" w:w="100"/>
+            </w:tcMar>
+          </w:tcPr>
+          <w:p>
+            <w:pPr>
+              <w:spacing w:after="40"/>
+            </w:pPr>
+            <w:r>
+              <w:rPr>
+                <w:rFonts w:ascii="Calibri" w:cs="Calibri" w:eastAsia="Calibri" w:hAnsi="Calibri"/>
+                <w:sz w:val="20"/>
+                <w:szCs w:val="20"/>
+              </w:rPr>
+              <w:t xml:space="preserve">2</w:t>
+            </w:r>
+          </w:p>
+        </w:tc>
+        <w:tc>
+          <w:tcPr>
+            <w:tcW w:type="dxa" w:w="4766"/>
+            <w:tcBorders>
+              <w:top w:val="single" w:color="808080" w:sz="4"/>
+              <w:left w:val="single" w:color="808080" w:sz="4"/>
+              <w:bottom w:val="single" w:color="808080" w:sz="4"/>
+              <w:right w:val="single" w:color="808080" w:sz="4"/>
+            </w:tcBorders>
+            <w:tcMar>
+              <w:top w:type="dxa" w:w="60"/>
+              <w:left w:type="dxa" w:w="100"/>
+              <w:bottom w:type="dxa" w:w="60"/>
+              <w:right w:type="dxa" w:w="100"/>
+            </w:tcMar>
+          </w:tcPr>
+          <w:p>
+            <w:pPr>
+              <w:spacing w:after="40"/>
+            </w:pPr>
+            <w:r>
+              <w:rPr>
+                <w:rFonts w:ascii="Calibri" w:cs="Calibri" w:eastAsia="Calibri" w:hAnsi="Calibri"/>
+                <w:sz w:val="20"/>
+                <w:szCs w:val="20"/>
+              </w:rPr>
+              <w:t xml:space="preserve">Entity Set</w:t>
+            </w:r>
+          </w:p>
+        </w:tc>
+        <w:tc>
+          <w:tcPr>
+            <w:tcW w:type="dxa" w:w="1300"/>
+            <w:tcBorders>
+              <w:top w:val="single" w:color="808080" w:sz="4"/>
+              <w:left w:val="single" w:color="808080" w:sz="4"/>
+              <w:bottom w:val="single" w:color="808080" w:sz="4"/>
+              <w:right w:val="single" w:color="808080" w:sz="4"/>
+            </w:tcBorders>
+            <w:tcMar>
+              <w:top w:type="dxa" w:w="60"/>
+              <w:left w:type="dxa" w:w="100"/>
+              <w:bottom w:type="dxa" w:w="60"/>
+              <w:right w:type="dxa" w:w="100"/>
+            </w:tcMar>
+          </w:tcPr>
+          <w:p>
+            <w:pPr>
+              <w:spacing w:after="40"/>
+            </w:pPr>
+            <w:r>
+              <w:rPr>
+                <w:rFonts w:ascii="Calibri" w:cs="Calibri" w:eastAsia="Calibri" w:hAnsi="Calibri"/>
+                <w:sz w:val="20"/>
+                <w:szCs w:val="20"/>
+              </w:rPr>
+              <w:t xml:space="preserve">4</w:t>
+            </w:r>
+          </w:p>
+        </w:tc>
+        <w:tc>
+          <w:tcPr>
+            <w:tcW w:type="dxa" w:w="1700"/>
+            <w:tcBorders>
+              <w:top w:val="single" w:color="808080" w:sz="4"/>
+              <w:left w:val="single" w:color="808080" w:sz="4"/>
+              <w:bottom w:val="single" w:color="808080" w:sz="4"/>
+              <w:right w:val="single" w:color="808080" w:sz="4"/>
+            </w:tcBorders>
+            <w:tcMar>
+              <w:top w:type="dxa" w:w="60"/>
+              <w:left w:type="dxa" w:w="100"/>
+              <w:bottom w:type="dxa" w:w="60"/>
+              <w:right w:type="dxa" w:w="100"/>
+            </w:tcMar>
+          </w:tcPr>
+          <w:p>
+            <w:pPr>
+              <w:spacing w:after="40"/>
+            </w:pPr>
+            <w:r>
+              <w:rPr>
+                <w:rFonts w:ascii="Calibri" w:cs="Calibri" w:eastAsia="Calibri" w:hAnsi="Calibri"/>
+                <w:sz w:val="20"/>
+                <w:szCs w:val="20"/>
+              </w:rPr>
+              <w:t xml:space="preserve">____</w:t>
+            </w:r>
+          </w:p>
+        </w:tc>
+        <w:tc>
+          <w:tcPr>
+            <w:tcW w:type="dxa" w:w="2000"/>
+            <w:tcBorders>
+              <w:top w:val="single" w:color="808080" w:sz="4"/>
+              <w:left w:val="single" w:color="808080" w:sz="4"/>
+              <w:bottom w:val="single" w:color="808080" w:sz="4"/>
+              <w:right w:val="single" w:color="808080" w:sz="4"/>
+            </w:tcBorders>
+            <w:tcMar>
+              <w:top w:type="dxa" w:w="60"/>
+              <w:left w:type="dxa" w:w="100"/>
+              <w:bottom w:type="dxa" w:w="60"/>
+              <w:right w:type="dxa" w:w="100"/>
+            </w:tcMar>
+          </w:tcPr>
+          <w:p>
+            <w:pPr>
+              <w:spacing w:after="40"/>
+            </w:pPr>
+            <w:r>
+              <w:rPr>
+                <w:rFonts w:ascii="Calibri" w:cs="Calibri" w:eastAsia="Calibri" w:hAnsi="Calibri"/>
+                <w:sz w:val="20"/>
+                <w:szCs w:val="20"/>
+              </w:rPr>
+              <w:t xml:space="preserve">____</w:t>
+            </w:r>
+          </w:p>
+        </w:tc>
+      </w:tr>
+      <w:tr>
+        <w:trPr>
+          <w:cantSplit/>
+          <w:tblHeader w:val="off"/>
+        </w:trPr>
+        <w:tc>
+          <w:tcPr>
+            <w:tcW w:type="dxa" w:w="700"/>
+            <w:tcBorders>
+              <w:top w:val="single" w:color="808080" w:sz="4"/>
+              <w:left w:val="single" w:color="808080" w:sz="4"/>
+              <w:bottom w:val="single" w:color="808080" w:sz="4"/>
+              <w:right w:val="single" w:color="808080" w:sz="4"/>
+            </w:tcBorders>
+            <w:tcMar>
+              <w:top w:type="dxa" w:w="60"/>
+              <w:left w:type="dxa" w:w="100"/>
+              <w:bottom w:type="dxa" w:w="60"/>
+              <w:right w:type="dxa" w:w="100"/>
+            </w:tcMar>
+          </w:tcPr>
+          <w:p>
+            <w:pPr>
+              <w:spacing w:after="40"/>
+            </w:pPr>
+            <w:r>
+              <w:rPr>
+                <w:rFonts w:ascii="Calibri" w:cs="Calibri" w:eastAsia="Calibri" w:hAnsi="Calibri"/>
+                <w:sz w:val="20"/>
+                <w:szCs w:val="20"/>
+              </w:rPr>
+              <w:t xml:space="preserve">3</w:t>
+            </w:r>
+          </w:p>
+        </w:tc>
+        <w:tc>
+          <w:tcPr>
+            <w:tcW w:type="dxa" w:w="4766"/>
+            <w:tcBorders>
+              <w:top w:val="single" w:color="808080" w:sz="4"/>
+              <w:left w:val="single" w:color="808080" w:sz="4"/>
+              <w:bottom w:val="single" w:color="808080" w:sz="4"/>
+              <w:right w:val="single" w:color="808080" w:sz="4"/>
+            </w:tcBorders>
+            <w:tcMar>
+              <w:top w:type="dxa" w:w="60"/>
+              <w:left w:type="dxa" w:w="100"/>
+              <w:bottom w:type="dxa" w:w="60"/>
+              <w:right w:type="dxa" w:w="100"/>
+            </w:tcMar>
+          </w:tcPr>
+          <w:p>
+            <w:pPr>
+              <w:spacing w:after="40"/>
+            </w:pPr>
+            <w:r>
+              <w:rPr>
+                <w:rFonts w:ascii="Calibri" w:cs="Calibri" w:eastAsia="Calibri" w:hAnsi="Calibri"/>
+                <w:sz w:val="20"/>
+                <w:szCs w:val="20"/>
+              </w:rPr>
+              <w:t xml:space="preserve">Attribute</w:t>
+            </w:r>
+          </w:p>
+        </w:tc>
+        <w:tc>
+          <w:tcPr>
+            <w:tcW w:type="dxa" w:w="1300"/>
+            <w:tcBorders>
+              <w:top w:val="single" w:color="808080" w:sz="4"/>
+              <w:left w:val="single" w:color="808080" w:sz="4"/>
+              <w:bottom w:val="single" w:color="808080" w:sz="4"/>
+              <w:right w:val="single" w:color="808080" w:sz="4"/>
+            </w:tcBorders>
+            <w:tcMar>
+              <w:top w:type="dxa" w:w="60"/>
+              <w:left w:type="dxa" w:w="100"/>
+              <w:bottom w:type="dxa" w:w="60"/>
+              <w:right w:type="dxa" w:w="100"/>
+            </w:tcMar>
+          </w:tcPr>
+          <w:p>
+            <w:pPr>
+              <w:spacing w:after="40"/>
+            </w:pPr>
+            <w:r>
+              <w:rPr>
+                <w:rFonts w:ascii="Calibri" w:cs="Calibri" w:eastAsia="Calibri" w:hAnsi="Calibri"/>
+                <w:sz w:val="20"/>
+                <w:szCs w:val="20"/>
+              </w:rPr>
+              <w:t xml:space="preserve">5</w:t>
+            </w:r>
+          </w:p>
+        </w:tc>
+        <w:tc>
+          <w:tcPr>
+            <w:tcW w:type="dxa" w:w="1700"/>
+            <w:tcBorders>
+              <w:top w:val="single" w:color="808080" w:sz="4"/>
+              <w:left w:val="single" w:color="808080" w:sz="4"/>
+              <w:bottom w:val="single" w:color="808080" w:sz="4"/>
+              <w:right w:val="single" w:color="808080" w:sz="4"/>
+            </w:tcBorders>
+            <w:tcMar>
+              <w:top w:type="dxa" w:w="60"/>
+              <w:left w:type="dxa" w:w="100"/>
+              <w:bottom w:type="dxa" w:w="60"/>
+              <w:right w:type="dxa" w:w="100"/>
+            </w:tcMar>
+          </w:tcPr>
+          <w:p>
+            <w:pPr>
+              <w:spacing w:after="40"/>
+            </w:pPr>
+            <w:r>
+              <w:rPr>
+                <w:rFonts w:ascii="Calibri" w:cs="Calibri" w:eastAsia="Calibri" w:hAnsi="Calibri"/>
+                <w:sz w:val="20"/>
+                <w:szCs w:val="20"/>
+              </w:rPr>
+              <w:t xml:space="preserve">____</w:t>
+            </w:r>
+          </w:p>
+        </w:tc>
+        <w:tc>
+          <w:tcPr>
+            <w:tcW w:type="dxa" w:w="2000"/>
+            <w:tcBorders>
+              <w:top w:val="single" w:color="808080" w:sz="4"/>
+              <w:left w:val="single" w:color="808080" w:sz="4"/>
+              <w:bottom w:val="single" w:color="808080" w:sz="4"/>
+              <w:right w:val="single" w:color="808080" w:sz="4"/>
+            </w:tcBorders>
+            <w:tcMar>
+              <w:top w:type="dxa" w:w="60"/>
+              <w:left w:type="dxa" w:w="100"/>
+              <w:bottom w:type="dxa" w:w="60"/>
+              <w:right w:type="dxa" w:w="100"/>
+            </w:tcMar>
+          </w:tcPr>
+          <w:p>
+            <w:pPr>
+              <w:spacing w:after="40"/>
+            </w:pPr>
+            <w:r>
+              <w:rPr>
+                <w:rFonts w:ascii="Calibri" w:cs="Calibri" w:eastAsia="Calibri" w:hAnsi="Calibri"/>
+                <w:sz w:val="20"/>
+                <w:szCs w:val="20"/>
+              </w:rPr>
+              <w:t xml:space="preserve">____</w:t>
+            </w:r>
+          </w:p>
+        </w:tc>
+      </w:tr>
+      <w:tr>
+        <w:trPr>
+          <w:cantSplit/>
+          <w:tblHeader w:val="off"/>
+        </w:trPr>
+        <w:tc>
+          <w:tcPr>
+            <w:tcW w:type="dxa" w:w="700"/>
+            <w:tcBorders>
+              <w:top w:val="single" w:color="808080" w:sz="4"/>
+              <w:left w:val="single" w:color="808080" w:sz="4"/>
+              <w:bottom w:val="single" w:color="808080" w:sz="4"/>
+              <w:right w:val="single" w:color="808080" w:sz="4"/>
+            </w:tcBorders>
+            <w:tcMar>
+              <w:top w:type="dxa" w:w="60"/>
+              <w:left w:type="dxa" w:w="100"/>
+              <w:bottom w:type="dxa" w:w="60"/>
+              <w:right w:type="dxa" w:w="100"/>
+            </w:tcMar>
+          </w:tcPr>
+          <w:p>
+            <w:pPr>
+              <w:spacing w:after="40"/>
+            </w:pPr>
+            <w:r>
+              <w:rPr>
+                <w:rFonts w:ascii="Calibri" w:cs="Calibri" w:eastAsia="Calibri" w:hAnsi="Calibri"/>
+                <w:sz w:val="20"/>
+                <w:szCs w:val="20"/>
+              </w:rPr>
+              <w:t xml:space="preserve">4</w:t>
+            </w:r>
+          </w:p>
+        </w:tc>
+        <w:tc>
+          <w:tcPr>
+            <w:tcW w:type="dxa" w:w="4766"/>
+            <w:tcBorders>
+              <w:top w:val="single" w:color="808080" w:sz="4"/>
+              <w:left w:val="single" w:color="808080" w:sz="4"/>
+              <w:bottom w:val="single" w:color="808080" w:sz="4"/>
+              <w:right w:val="single" w:color="808080" w:sz="4"/>
+            </w:tcBorders>
+            <w:tcMar>
+              <w:top w:type="dxa" w:w="60"/>
+              <w:left w:type="dxa" w:w="100"/>
+              <w:bottom w:type="dxa" w:w="60"/>
+              <w:right w:type="dxa" w:w="100"/>
+            </w:tcMar>
+          </w:tcPr>
+          <w:p>
+            <w:pPr>
+              <w:spacing w:after="40"/>
+            </w:pPr>
+            <w:r>
+              <w:rPr>
+                <w:rFonts w:ascii="Calibri" w:cs="Calibri" w:eastAsia="Calibri" w:hAnsi="Calibri"/>
+                <w:sz w:val="20"/>
+                <w:szCs w:val="20"/>
+              </w:rPr>
+              <w:t xml:space="preserve">Composite Attribute</w:t>
+            </w:r>
+          </w:p>
+        </w:tc>
+        <w:tc>
+          <w:tcPr>
+            <w:tcW w:type="dxa" w:w="1300"/>
+            <w:tcBorders>
+              <w:top w:val="single" w:color="808080" w:sz="4"/>
+              <w:left w:val="single" w:color="808080" w:sz="4"/>
+              <w:bottom w:val="single" w:color="808080" w:sz="4"/>
+              <w:right w:val="single" w:color="808080" w:sz="4"/>
+            </w:tcBorders>
+            <w:tcMar>
+              <w:top w:type="dxa" w:w="60"/>
+              <w:left w:type="dxa" w:w="100"/>
+              <w:bottom w:type="dxa" w:w="60"/>
+              <w:right w:type="dxa" w:w="100"/>
+            </w:tcMar>
+          </w:tcPr>
+          <w:p>
+            <w:pPr>
+              <w:spacing w:after="40"/>
+            </w:pPr>
+            <w:r>
+              <w:rPr>
+                <w:rFonts w:ascii="Calibri" w:cs="Calibri" w:eastAsia="Calibri" w:hAnsi="Calibri"/>
+                <w:sz w:val="20"/>
+                <w:szCs w:val="20"/>
+              </w:rPr>
+              <w:t xml:space="preserve">3</w:t>
+            </w:r>
+          </w:p>
+        </w:tc>
+        <w:tc>
+          <w:tcPr>
+            <w:tcW w:type="dxa" w:w="1700"/>
+            <w:tcBorders>
+              <w:top w:val="single" w:color="808080" w:sz="4"/>
+              <w:left w:val="single" w:color="808080" w:sz="4"/>
+              <w:bottom w:val="single" w:color="808080" w:sz="4"/>
+              <w:right w:val="single" w:color="808080" w:sz="4"/>
+            </w:tcBorders>
+            <w:tcMar>
+              <w:top w:type="dxa" w:w="60"/>
+              <w:left w:type="dxa" w:w="100"/>
+              <w:bottom w:type="dxa" w:w="60"/>
+              <w:right w:type="dxa" w:w="100"/>
+            </w:tcMar>
+          </w:tcPr>
+          <w:p>
+            <w:pPr>
+              <w:spacing w:after="40"/>
+            </w:pPr>
+            <w:r>
+              <w:rPr>
+                <w:rFonts w:ascii="Calibri" w:cs="Calibri" w:eastAsia="Calibri" w:hAnsi="Calibri"/>
+                <w:sz w:val="20"/>
+                <w:szCs w:val="20"/>
+              </w:rPr>
+              <w:t xml:space="preserve">____</w:t>
+            </w:r>
+          </w:p>
+        </w:tc>
+        <w:tc>
+          <w:tcPr>
+            <w:tcW w:type="dxa" w:w="2000"/>
+            <w:tcBorders>
+              <w:top w:val="single" w:color="808080" w:sz="4"/>
+              <w:left w:val="single" w:color="808080" w:sz="4"/>
+              <w:bottom w:val="single" w:color="808080" w:sz="4"/>
+              <w:right w:val="single" w:color="808080" w:sz="4"/>
+            </w:tcBorders>
+            <w:tcMar>
+              <w:top w:type="dxa" w:w="60"/>
+              <w:left w:type="dxa" w:w="100"/>
+              <w:bottom w:type="dxa" w:w="60"/>
+              <w:right w:type="dxa" w:w="100"/>
+            </w:tcMar>
+          </w:tcPr>
+          <w:p>
+            <w:pPr>
+              <w:spacing w:after="40"/>
+            </w:pPr>
+            <w:r>
+              <w:rPr>
+                <w:rFonts w:ascii="Calibri" w:cs="Calibri" w:eastAsia="Calibri" w:hAnsi="Calibri"/>
+                <w:sz w:val="20"/>
+                <w:szCs w:val="20"/>
+              </w:rPr>
+              <w:t xml:space="preserve">____</w:t>
+            </w:r>
+          </w:p>
+        </w:tc>
+      </w:tr>
+      <w:tr>
+        <w:trPr>
+          <w:cantSplit/>
+          <w:tblHeader w:val="off"/>
+        </w:trPr>
+        <w:tc>
+          <w:tcPr>
+            <w:tcW w:type="dxa" w:w="700"/>
+            <w:tcBorders>
+              <w:top w:val="single" w:color="808080" w:sz="4"/>
+              <w:left w:val="single" w:color="808080" w:sz="4"/>
+              <w:bottom w:val="single" w:color="808080" w:sz="4"/>
+              <w:right w:val="single" w:color="808080" w:sz="4"/>
+            </w:tcBorders>
+            <w:tcMar>
+              <w:top w:type="dxa" w:w="60"/>
+              <w:left w:type="dxa" w:w="100"/>
+              <w:bottom w:type="dxa" w:w="60"/>
+              <w:right w:type="dxa" w:w="100"/>
+            </w:tcMar>
+          </w:tcPr>
+          <w:p>
+            <w:pPr>
+              <w:spacing w:after="40"/>
+            </w:pPr>
+            <w:r>
+              <w:rPr>
+                <w:rFonts w:ascii="Calibri" w:cs="Calibri" w:eastAsia="Calibri" w:hAnsi="Calibri"/>
+                <w:sz w:val="20"/>
+                <w:szCs w:val="20"/>
+              </w:rPr>
+              <w:t xml:space="preserve">5</w:t>
+            </w:r>
+          </w:p>
+        </w:tc>
+        <w:tc>
+          <w:tcPr>
+            <w:tcW w:type="dxa" w:w="4766"/>
+            <w:tcBorders>
+              <w:top w:val="single" w:color="808080" w:sz="4"/>
+              <w:left w:val="single" w:color="808080" w:sz="4"/>
+              <w:bottom w:val="single" w:color="808080" w:sz="4"/>
+              <w:right w:val="single" w:color="808080" w:sz="4"/>
+            </w:tcBorders>
+            <w:tcMar>
+              <w:top w:type="dxa" w:w="60"/>
+              <w:left w:type="dxa" w:w="100"/>
+              <w:bottom w:type="dxa" w:w="60"/>
+              <w:right w:type="dxa" w:w="100"/>
+            </w:tcMar>
+          </w:tcPr>
+          <w:p>
+            <w:pPr>
+              <w:spacing w:after="40"/>
+            </w:pPr>
+            <w:r>
+              <w:rPr>
+                <w:rFonts w:ascii="Calibri" w:cs="Calibri" w:eastAsia="Calibri" w:hAnsi="Calibri"/>
+                <w:sz w:val="20"/>
+                <w:szCs w:val="20"/>
+              </w:rPr>
+              <w:t xml:space="preserve">Multivalued Attribute</w:t>
+            </w:r>
+          </w:p>
+        </w:tc>
+        <w:tc>
+          <w:tcPr>
+            <w:tcW w:type="dxa" w:w="1300"/>
+            <w:tcBorders>
+              <w:top w:val="single" w:color="808080" w:sz="4"/>
+              <w:left w:val="single" w:color="808080" w:sz="4"/>
+              <w:bottom w:val="single" w:color="808080" w:sz="4"/>
+              <w:right w:val="single" w:color="808080" w:sz="4"/>
+            </w:tcBorders>
+            <w:tcMar>
+              <w:top w:type="dxa" w:w="60"/>
+              <w:left w:type="dxa" w:w="100"/>
+              <w:bottom w:type="dxa" w:w="60"/>
+              <w:right w:type="dxa" w:w="100"/>
+            </w:tcMar>
+          </w:tcPr>
+          <w:p>
+            <w:pPr>
+              <w:spacing w:after="40"/>
+            </w:pPr>
+            <w:r>
+              <w:rPr>
+                <w:rFonts w:ascii="Calibri" w:cs="Calibri" w:eastAsia="Calibri" w:hAnsi="Calibri"/>
+                <w:sz w:val="20"/>
+                <w:szCs w:val="20"/>
+              </w:rPr>
+              <w:t xml:space="preserve">3</w:t>
+            </w:r>
+          </w:p>
+        </w:tc>
+        <w:tc>
+          <w:tcPr>
+            <w:tcW w:type="dxa" w:w="1700"/>
+            <w:tcBorders>
+              <w:top w:val="single" w:color="808080" w:sz="4"/>
+              <w:left w:val="single" w:color="808080" w:sz="4"/>
+              <w:bottom w:val="single" w:color="808080" w:sz="4"/>
+              <w:right w:val="single" w:color="808080" w:sz="4"/>
+            </w:tcBorders>
+            <w:tcMar>
+              <w:top w:type="dxa" w:w="60"/>
+              <w:left w:type="dxa" w:w="100"/>
+              <w:bottom w:type="dxa" w:w="60"/>
+              <w:right w:type="dxa" w:w="100"/>
+            </w:tcMar>
+          </w:tcPr>
+          <w:p>
+            <w:pPr>
+              <w:spacing w:after="40"/>
+            </w:pPr>
+            <w:r>
+              <w:rPr>
+                <w:rFonts w:ascii="Calibri" w:cs="Calibri" w:eastAsia="Calibri" w:hAnsi="Calibri"/>
+                <w:sz w:val="20"/>
+                <w:szCs w:val="20"/>
+              </w:rPr>
+              <w:t xml:space="preserve">____</w:t>
+            </w:r>
+          </w:p>
+        </w:tc>
+        <w:tc>
+          <w:tcPr>
+            <w:tcW w:type="dxa" w:w="2000"/>
+            <w:tcBorders>
+              <w:top w:val="single" w:color="808080" w:sz="4"/>
+              <w:left w:val="single" w:color="808080" w:sz="4"/>
+              <w:bottom w:val="single" w:color="808080" w:sz="4"/>
+              <w:right w:val="single" w:color="808080" w:sz="4"/>
+            </w:tcBorders>
+            <w:tcMar>
+              <w:top w:type="dxa" w:w="60"/>
+              <w:left w:type="dxa" w:w="100"/>
+              <w:bottom w:type="dxa" w:w="60"/>
+              <w:right w:type="dxa" w:w="100"/>
+            </w:tcMar>
+          </w:tcPr>
+          <w:p>
+            <w:pPr>
+              <w:spacing w:after="40"/>
+            </w:pPr>
+            <w:r>
+              <w:rPr>
+                <w:rFonts w:ascii="Calibri" w:cs="Calibri" w:eastAsia="Calibri" w:hAnsi="Calibri"/>
+                <w:sz w:val="20"/>
+                <w:szCs w:val="20"/>
+              </w:rPr>
+              <w:t xml:space="preserve">____</w:t>
+            </w:r>
+          </w:p>
+        </w:tc>
+      </w:tr>
+      <w:tr>
+        <w:trPr>
+          <w:cantSplit/>
+          <w:tblHeader w:val="off"/>
+        </w:trPr>
+        <w:tc>
+          <w:tcPr>
+            <w:tcW w:type="dxa" w:w="700"/>
+            <w:tcBorders>
+              <w:top w:val="single" w:color="808080" w:sz="4"/>
+              <w:left w:val="single" w:color="808080" w:sz="4"/>
+              <w:bottom w:val="single" w:color="808080" w:sz="4"/>
+              <w:right w:val="single" w:color="808080" w:sz="4"/>
+            </w:tcBorders>
+            <w:tcMar>
+              <w:top w:type="dxa" w:w="60"/>
+              <w:left w:type="dxa" w:w="100"/>
+              <w:bottom w:type="dxa" w:w="60"/>
+              <w:right w:type="dxa" w:w="100"/>
+            </w:tcMar>
+          </w:tcPr>
+          <w:p>
+            <w:pPr>
+              <w:spacing w:after="40"/>
+            </w:pPr>
+            <w:r>
+              <w:rPr>
+                <w:rFonts w:ascii="Calibri" w:cs="Calibri" w:eastAsia="Calibri" w:hAnsi="Calibri"/>
+                <w:sz w:val="20"/>
+                <w:szCs w:val="20"/>
+              </w:rPr>
+              <w:t xml:space="preserve">6</w:t>
+            </w:r>
+          </w:p>
+        </w:tc>
+        <w:tc>
+          <w:tcPr>
+            <w:tcW w:type="dxa" w:w="4766"/>
+            <w:tcBorders>
+              <w:top w:val="single" w:color="808080" w:sz="4"/>
+              <w:left w:val="single" w:color="808080" w:sz="4"/>
+              <w:bottom w:val="single" w:color="808080" w:sz="4"/>
+              <w:right w:val="single" w:color="808080" w:sz="4"/>
+            </w:tcBorders>
+            <w:tcMar>
+              <w:top w:type="dxa" w:w="60"/>
+              <w:left w:type="dxa" w:w="100"/>
+              <w:bottom w:type="dxa" w:w="60"/>
+              <w:right w:type="dxa" w:w="100"/>
+            </w:tcMar>
+          </w:tcPr>
+          <w:p>
+            <w:pPr>
+              <w:spacing w:after="40"/>
+            </w:pPr>
+            <w:r>
+              <w:rPr>
+                <w:rFonts w:ascii="Calibri" w:cs="Calibri" w:eastAsia="Calibri" w:hAnsi="Calibri"/>
+                <w:sz w:val="20"/>
+                <w:szCs w:val="20"/>
+              </w:rPr>
+              <w:t xml:space="preserve">Derived Attribute</w:t>
+            </w:r>
+          </w:p>
+        </w:tc>
+        <w:tc>
+          <w:tcPr>
+            <w:tcW w:type="dxa" w:w="1300"/>
+            <w:tcBorders>
+              <w:top w:val="single" w:color="808080" w:sz="4"/>
+              <w:left w:val="single" w:color="808080" w:sz="4"/>
+              <w:bottom w:val="single" w:color="808080" w:sz="4"/>
+              <w:right w:val="single" w:color="808080" w:sz="4"/>
+            </w:tcBorders>
+            <w:tcMar>
+              <w:top w:type="dxa" w:w="60"/>
+              <w:left w:type="dxa" w:w="100"/>
+              <w:bottom w:type="dxa" w:w="60"/>
+              <w:right w:type="dxa" w:w="100"/>
+            </w:tcMar>
+          </w:tcPr>
+          <w:p>
+            <w:pPr>
+              <w:spacing w:after="40"/>
+            </w:pPr>
+            <w:r>
+              <w:rPr>
+                <w:rFonts w:ascii="Calibri" w:cs="Calibri" w:eastAsia="Calibri" w:hAnsi="Calibri"/>
+                <w:sz w:val="20"/>
+                <w:szCs w:val="20"/>
+              </w:rPr>
+              <w:t xml:space="preserve">3</w:t>
+            </w:r>
+          </w:p>
+        </w:tc>
+        <w:tc>
+          <w:tcPr>
+            <w:tcW w:type="dxa" w:w="1700"/>
+            <w:tcBorders>
+              <w:top w:val="single" w:color="808080" w:sz="4"/>
+              <w:left w:val="single" w:color="808080" w:sz="4"/>
+              <w:bottom w:val="single" w:color="808080" w:sz="4"/>
+              <w:right w:val="single" w:color="808080" w:sz="4"/>
+            </w:tcBorders>
+            <w:tcMar>
+              <w:top w:type="dxa" w:w="60"/>
+              <w:left w:type="dxa" w:w="100"/>
+              <w:bottom w:type="dxa" w:w="60"/>
+              <w:right w:type="dxa" w:w="100"/>
+            </w:tcMar>
+          </w:tcPr>
+          <w:p>
+            <w:pPr>
+              <w:spacing w:after="40"/>
+            </w:pPr>
+            <w:r>
+              <w:rPr>
+                <w:rFonts w:ascii="Calibri" w:cs="Calibri" w:eastAsia="Calibri" w:hAnsi="Calibri"/>
+                <w:sz w:val="20"/>
+                <w:szCs w:val="20"/>
+              </w:rPr>
+              <w:t xml:space="preserve">____</w:t>
+            </w:r>
+          </w:p>
+        </w:tc>
+        <w:tc>
+          <w:tcPr>
+            <w:tcW w:type="dxa" w:w="2000"/>
+            <w:tcBorders>
+              <w:top w:val="single" w:color="808080" w:sz="4"/>
+              <w:left w:val="single" w:color="808080" w:sz="4"/>
+              <w:bottom w:val="single" w:color="808080" w:sz="4"/>
+              <w:right w:val="single" w:color="808080" w:sz="4"/>
+            </w:tcBorders>
+            <w:tcMar>
+              <w:top w:type="dxa" w:w="60"/>
+              <w:left w:type="dxa" w:w="100"/>
+              <w:bottom w:type="dxa" w:w="60"/>
+              <w:right w:type="dxa" w:w="100"/>
+            </w:tcMar>
+          </w:tcPr>
+          <w:p>
+            <w:pPr>
+              <w:spacing w:after="40"/>
+            </w:pPr>
+            <w:r>
+              <w:rPr>
+                <w:rFonts w:ascii="Calibri" w:cs="Calibri" w:eastAsia="Calibri" w:hAnsi="Calibri"/>
+                <w:sz w:val="20"/>
+                <w:szCs w:val="20"/>
+              </w:rPr>
+              <w:t xml:space="preserve">____</w:t>
+            </w:r>
+          </w:p>
+        </w:tc>
+      </w:tr>
+      <w:tr>
+        <w:trPr>
+          <w:cantSplit/>
+          <w:tblHeader w:val="off"/>
+        </w:trPr>
+        <w:tc>
+          <w:tcPr>
+            <w:tcW w:type="dxa" w:w="700"/>
+            <w:tcBorders>
+              <w:top w:val="single" w:color="808080" w:sz="4"/>
+              <w:left w:val="single" w:color="808080" w:sz="4"/>
+              <w:bottom w:val="single" w:color="808080" w:sz="4"/>
+              <w:right w:val="single" w:color="808080" w:sz="4"/>
+            </w:tcBorders>
+            <w:tcMar>
+              <w:top w:type="dxa" w:w="60"/>
+              <w:left w:type="dxa" w:w="100"/>
+              <w:bottom w:type="dxa" w:w="60"/>
+              <w:right w:type="dxa" w:w="100"/>
+            </w:tcMar>
+          </w:tcPr>
+          <w:p>
+            <w:pPr>
+              <w:spacing w:after="40"/>
+            </w:pPr>
+            <w:r>
+              <w:rPr>
+                <w:rFonts w:ascii="Calibri" w:cs="Calibri" w:eastAsia="Calibri" w:hAnsi="Calibri"/>
+                <w:sz w:val="20"/>
+                <w:szCs w:val="20"/>
+              </w:rPr>
+              <w:t xml:space="preserve">7</w:t>
+            </w:r>
+          </w:p>
+        </w:tc>
+        <w:tc>
+          <w:tcPr>
+            <w:tcW w:type="dxa" w:w="4766"/>
+            <w:tcBorders>
+              <w:top w:val="single" w:color="808080" w:sz="4"/>
+              <w:left w:val="single" w:color="808080" w:sz="4"/>
+              <w:bottom w:val="single" w:color="808080" w:sz="4"/>
+              <w:right w:val="single" w:color="808080" w:sz="4"/>
+            </w:tcBorders>
+            <w:tcMar>
+              <w:top w:type="dxa" w:w="60"/>
+              <w:left w:type="dxa" w:w="100"/>
+              <w:bottom w:type="dxa" w:w="60"/>
+              <w:right w:type="dxa" w:w="100"/>
+            </w:tcMar>
+          </w:tcPr>
+          <w:p>
+            <w:pPr>
+              <w:spacing w:after="40"/>
+            </w:pPr>
+            <w:r>
+              <w:rPr>
+                <w:rFonts w:ascii="Calibri" w:cs="Calibri" w:eastAsia="Calibri" w:hAnsi="Calibri"/>
+                <w:sz w:val="20"/>
+                <w:szCs w:val="20"/>
+              </w:rPr>
+              <w:t xml:space="preserve">Relationship</w:t>
+            </w:r>
+          </w:p>
+        </w:tc>
+        <w:tc>
+          <w:tcPr>
+            <w:tcW w:type="dxa" w:w="1300"/>
+            <w:tcBorders>
+              <w:top w:val="single" w:color="808080" w:sz="4"/>
+              <w:left w:val="single" w:color="808080" w:sz="4"/>
+              <w:bottom w:val="single" w:color="808080" w:sz="4"/>
+              <w:right w:val="single" w:color="808080" w:sz="4"/>
+            </w:tcBorders>
+            <w:tcMar>
+              <w:top w:type="dxa" w:w="60"/>
+              <w:left w:type="dxa" w:w="100"/>
+              <w:bottom w:type="dxa" w:w="60"/>
+              <w:right w:type="dxa" w:w="100"/>
+            </w:tcMar>
+          </w:tcPr>
+          <w:p>
+            <w:pPr>
+              <w:spacing w:after="40"/>
+            </w:pPr>
+            <w:r>
+              <w:rPr>
+                <w:rFonts w:ascii="Calibri" w:cs="Calibri" w:eastAsia="Calibri" w:hAnsi="Calibri"/>
+                <w:sz w:val="20"/>
+                <w:szCs w:val="20"/>
+              </w:rPr>
+              <w:t xml:space="preserve">5</w:t>
+            </w:r>
+          </w:p>
+        </w:tc>
+        <w:tc>
+          <w:tcPr>
+            <w:tcW w:type="dxa" w:w="1700"/>
+            <w:tcBorders>
+              <w:top w:val="single" w:color="808080" w:sz="4"/>
+              <w:left w:val="single" w:color="808080" w:sz="4"/>
+              <w:bottom w:val="single" w:color="808080" w:sz="4"/>
+              <w:right w:val="single" w:color="808080" w:sz="4"/>
+            </w:tcBorders>
+            <w:tcMar>
+              <w:top w:type="dxa" w:w="60"/>
+              <w:left w:type="dxa" w:w="100"/>
+              <w:bottom w:type="dxa" w:w="60"/>
+              <w:right w:type="dxa" w:w="100"/>
+            </w:tcMar>
+          </w:tcPr>
+          <w:p>
+            <w:pPr>
+              <w:spacing w:after="40"/>
+            </w:pPr>
+            <w:r>
+              <w:rPr>
+                <w:rFonts w:ascii="Calibri" w:cs="Calibri" w:eastAsia="Calibri" w:hAnsi="Calibri"/>
+                <w:sz w:val="20"/>
+                <w:szCs w:val="20"/>
+              </w:rPr>
+              <w:t xml:space="preserve">____</w:t>
+            </w:r>
+          </w:p>
+        </w:tc>
+        <w:tc>
+          <w:tcPr>
+            <w:tcW w:type="dxa" w:w="2000"/>
+            <w:tcBorders>
+              <w:top w:val="single" w:color="808080" w:sz="4"/>
+              <w:left w:val="single" w:color="808080" w:sz="4"/>
+              <w:bottom w:val="single" w:color="808080" w:sz="4"/>
+              <w:right w:val="single" w:color="808080" w:sz="4"/>
+            </w:tcBorders>
+            <w:tcMar>
+              <w:top w:type="dxa" w:w="60"/>
+              <w:left w:type="dxa" w:w="100"/>
+              <w:bottom w:type="dxa" w:w="60"/>
+              <w:right w:type="dxa" w:w="100"/>
+            </w:tcMar>
+          </w:tcPr>
+          <w:p>
+            <w:pPr>
+              <w:spacing w:after="40"/>
+            </w:pPr>
+            <w:r>
+              <w:rPr>
+                <w:rFonts w:ascii="Calibri" w:cs="Calibri" w:eastAsia="Calibri" w:hAnsi="Calibri"/>
+                <w:sz w:val="20"/>
+                <w:szCs w:val="20"/>
+              </w:rPr>
+              <w:t xml:space="preserve">____</w:t>
+            </w:r>
+          </w:p>
+        </w:tc>
+      </w:tr>
+      <w:tr>
+        <w:trPr>
+          <w:cantSplit/>
+          <w:tblHeader w:val="off"/>
+        </w:trPr>
+        <w:tc>
+          <w:tcPr>
+            <w:tcW w:type="dxa" w:w="700"/>
+            <w:tcBorders>
+              <w:top w:val="single" w:color="808080" w:sz="4"/>
+              <w:left w:val="single" w:color="808080" w:sz="4"/>
+              <w:bottom w:val="single" w:color="808080" w:sz="4"/>
+              <w:right w:val="single" w:color="808080" w:sz="4"/>
+            </w:tcBorders>
+            <w:tcMar>
+              <w:top w:type="dxa" w:w="60"/>
+              <w:left w:type="dxa" w:w="100"/>
+              <w:bottom w:type="dxa" w:w="60"/>
+              <w:right w:type="dxa" w:w="100"/>
+            </w:tcMar>
+          </w:tcPr>
+          <w:p>
+            <w:pPr>
+              <w:spacing w:after="40"/>
+            </w:pPr>
+            <w:r>
+              <w:rPr>
+                <w:rFonts w:ascii="Calibri" w:cs="Calibri" w:eastAsia="Calibri" w:hAnsi="Calibri"/>
+                <w:sz w:val="20"/>
+                <w:szCs w:val="20"/>
+              </w:rPr>
+              <w:t xml:space="preserve">8</w:t>
+            </w:r>
+          </w:p>
+        </w:tc>
+        <w:tc>
+          <w:tcPr>
+            <w:tcW w:type="dxa" w:w="4766"/>
+            <w:tcBorders>
+              <w:top w:val="single" w:color="808080" w:sz="4"/>
+              <w:left w:val="single" w:color="808080" w:sz="4"/>
+              <w:bottom w:val="single" w:color="808080" w:sz="4"/>
+              <w:right w:val="single" w:color="808080" w:sz="4"/>
+            </w:tcBorders>
+            <w:tcMar>
+              <w:top w:type="dxa" w:w="60"/>
+              <w:left w:type="dxa" w:w="100"/>
+              <w:bottom w:type="dxa" w:w="60"/>
+              <w:right w:type="dxa" w:w="100"/>
+            </w:tcMar>
+          </w:tcPr>
+          <w:p>
+            <w:pPr>
+              <w:spacing w:after="40"/>
+            </w:pPr>
+            <w:r>
+              <w:rPr>
+                <w:rFonts w:ascii="Calibri" w:cs="Calibri" w:eastAsia="Calibri" w:hAnsi="Calibri"/>
+                <w:sz w:val="20"/>
+                <w:szCs w:val="20"/>
+              </w:rPr>
+              <w:t xml:space="preserve">Cardinality</w:t>
+            </w:r>
+          </w:p>
+        </w:tc>
+        <w:tc>
+          <w:tcPr>
+            <w:tcW w:type="dxa" w:w="1300"/>
+            <w:tcBorders>
+              <w:top w:val="single" w:color="808080" w:sz="4"/>
+              <w:left w:val="single" w:color="808080" w:sz="4"/>
+              <w:bottom w:val="single" w:color="808080" w:sz="4"/>
+              <w:right w:val="single" w:color="808080" w:sz="4"/>
+            </w:tcBorders>
+            <w:tcMar>
+              <w:top w:type="dxa" w:w="60"/>
+              <w:left w:type="dxa" w:w="100"/>
+              <w:bottom w:type="dxa" w:w="60"/>
+              <w:right w:type="dxa" w:w="100"/>
+            </w:tcMar>
+          </w:tcPr>
+          <w:p>
+            <w:pPr>
+              <w:spacing w:after="40"/>
+            </w:pPr>
+            <w:r>
+              <w:rPr>
+                <w:rFonts w:ascii="Calibri" w:cs="Calibri" w:eastAsia="Calibri" w:hAnsi="Calibri"/>
+                <w:sz w:val="20"/>
+                <w:szCs w:val="20"/>
+              </w:rPr>
+              <w:t xml:space="preserve">4</w:t>
+            </w:r>
+          </w:p>
+        </w:tc>
+        <w:tc>
+          <w:tcPr>
+            <w:tcW w:type="dxa" w:w="1700"/>
+            <w:tcBorders>
+              <w:top w:val="single" w:color="808080" w:sz="4"/>
+              <w:left w:val="single" w:color="808080" w:sz="4"/>
+              <w:bottom w:val="single" w:color="808080" w:sz="4"/>
+              <w:right w:val="single" w:color="808080" w:sz="4"/>
+            </w:tcBorders>
+            <w:tcMar>
+              <w:top w:type="dxa" w:w="60"/>
+              <w:left w:type="dxa" w:w="100"/>
+              <w:bottom w:type="dxa" w:w="60"/>
+              <w:right w:type="dxa" w:w="100"/>
+            </w:tcMar>
+          </w:tcPr>
+          <w:p>
+            <w:pPr>
+              <w:spacing w:after="40"/>
+            </w:pPr>
+            <w:r>
+              <w:rPr>
+                <w:rFonts w:ascii="Calibri" w:cs="Calibri" w:eastAsia="Calibri" w:hAnsi="Calibri"/>
+                <w:sz w:val="20"/>
+                <w:szCs w:val="20"/>
+              </w:rPr>
+              <w:t xml:space="preserve">____</w:t>
+            </w:r>
+          </w:p>
+        </w:tc>
+        <w:tc>
+          <w:tcPr>
+            <w:tcW w:type="dxa" w:w="2000"/>
+            <w:tcBorders>
+              <w:top w:val="single" w:color="808080" w:sz="4"/>
+              <w:left w:val="single" w:color="808080" w:sz="4"/>
+              <w:bottom w:val="single" w:color="808080" w:sz="4"/>
+              <w:right w:val="single" w:color="808080" w:sz="4"/>
+            </w:tcBorders>
+            <w:tcMar>
+              <w:top w:type="dxa" w:w="60"/>
+              <w:left w:type="dxa" w:w="100"/>
+              <w:bottom w:type="dxa" w:w="60"/>
+              <w:right w:type="dxa" w:w="100"/>
+            </w:tcMar>
+          </w:tcPr>
+          <w:p>
+            <w:pPr>
+              <w:spacing w:after="40"/>
+            </w:pPr>
+            <w:r>
+              <w:rPr>
+                <w:rFonts w:ascii="Calibri" w:cs="Calibri" w:eastAsia="Calibri" w:hAnsi="Calibri"/>
+                <w:sz w:val="20"/>
+                <w:szCs w:val="20"/>
+              </w:rPr>
+              <w:t xml:space="preserve">____</w:t>
+            </w:r>
+          </w:p>
+        </w:tc>
+      </w:tr>
+      <w:tr>
+        <w:trPr>
+          <w:cantSplit/>
+          <w:tblHeader w:val="off"/>
+        </w:trPr>
+        <w:tc>
+          <w:tcPr>
+            <w:tcW w:type="dxa" w:w="700"/>
+            <w:tcBorders>
+              <w:top w:val="single" w:color="808080" w:sz="4"/>
+              <w:left w:val="single" w:color="808080" w:sz="4"/>
+              <w:bottom w:val="single" w:color="808080" w:sz="4"/>
+              <w:right w:val="single" w:color="808080" w:sz="4"/>
+            </w:tcBorders>
+            <w:tcMar>
+              <w:top w:type="dxa" w:w="60"/>
+              <w:left w:type="dxa" w:w="100"/>
+              <w:bottom w:type="dxa" w:w="60"/>
+              <w:right w:type="dxa" w:w="100"/>
+            </w:tcMar>
+          </w:tcPr>
+          <w:p>
+            <w:pPr>
+              <w:spacing w:after="40"/>
+            </w:pPr>
+            <w:r>
+              <w:rPr>
+                <w:rFonts w:ascii="Calibri" w:cs="Calibri" w:eastAsia="Calibri" w:hAnsi="Calibri"/>
+                <w:sz w:val="20"/>
+                <w:szCs w:val="20"/>
+              </w:rPr>
+              <w:t xml:space="preserve">9</w:t>
+            </w:r>
+          </w:p>
+        </w:tc>
+        <w:tc>
+          <w:tcPr>
+            <w:tcW w:type="dxa" w:w="4766"/>
+            <w:tcBorders>
+              <w:top w:val="single" w:color="808080" w:sz="4"/>
+              <w:left w:val="single" w:color="808080" w:sz="4"/>
+              <w:bottom w:val="single" w:color="808080" w:sz="4"/>
+              <w:right w:val="single" w:color="808080" w:sz="4"/>
+            </w:tcBorders>
+            <w:tcMar>
+              <w:top w:type="dxa" w:w="60"/>
+              <w:left w:type="dxa" w:w="100"/>
+              <w:bottom w:type="dxa" w:w="60"/>
+              <w:right w:type="dxa" w:w="100"/>
+            </w:tcMar>
+          </w:tcPr>
+          <w:p>
+            <w:pPr>
+              <w:spacing w:after="40"/>
+            </w:pPr>
+            <w:r>
+              <w:rPr>
+                <w:rFonts w:ascii="Calibri" w:cs="Calibri" w:eastAsia="Calibri" w:hAnsi="Calibri"/>
+                <w:sz w:val="20"/>
+                <w:szCs w:val="20"/>
+              </w:rPr>
+              <w:t xml:space="preserve">One-to-One Relationship</w:t>
+            </w:r>
+          </w:p>
+        </w:tc>
+        <w:tc>
+          <w:tcPr>
+            <w:tcW w:type="dxa" w:w="1300"/>
+            <w:tcBorders>
+              <w:top w:val="single" w:color="808080" w:sz="4"/>
+              <w:left w:val="single" w:color="808080" w:sz="4"/>
+              <w:bottom w:val="single" w:color="808080" w:sz="4"/>
+              <w:right w:val="single" w:color="808080" w:sz="4"/>
+            </w:tcBorders>
+            <w:tcMar>
+              <w:top w:type="dxa" w:w="60"/>
+              <w:left w:type="dxa" w:w="100"/>
+              <w:bottom w:type="dxa" w:w="60"/>
+              <w:right w:type="dxa" w:w="100"/>
+            </w:tcMar>
+          </w:tcPr>
+          <w:p>
+            <w:pPr>
+              <w:spacing w:after="40"/>
+            </w:pPr>
+            <w:r>
+              <w:rPr>
+                <w:rFonts w:ascii="Calibri" w:cs="Calibri" w:eastAsia="Calibri" w:hAnsi="Calibri"/>
+                <w:sz w:val="20"/>
+                <w:szCs w:val="20"/>
+              </w:rPr>
+              <w:t xml:space="preserve">4</w:t>
+            </w:r>
+          </w:p>
+        </w:tc>
+        <w:tc>
+          <w:tcPr>
+            <w:tcW w:type="dxa" w:w="1700"/>
+            <w:tcBorders>
+              <w:top w:val="single" w:color="808080" w:sz="4"/>
+              <w:left w:val="single" w:color="808080" w:sz="4"/>
+              <w:bottom w:val="single" w:color="808080" w:sz="4"/>
+              <w:right w:val="single" w:color="808080" w:sz="4"/>
+            </w:tcBorders>
+            <w:tcMar>
+              <w:top w:type="dxa" w:w="60"/>
+              <w:left w:type="dxa" w:w="100"/>
+              <w:bottom w:type="dxa" w:w="60"/>
+              <w:right w:type="dxa" w:w="100"/>
+            </w:tcMar>
+          </w:tcPr>
+          <w:p>
+            <w:pPr>
+              <w:spacing w:after="40"/>
+            </w:pPr>
+            <w:r>
+              <w:rPr>
+                <w:rFonts w:ascii="Calibri" w:cs="Calibri" w:eastAsia="Calibri" w:hAnsi="Calibri"/>
+                <w:sz w:val="20"/>
+                <w:szCs w:val="20"/>
+              </w:rPr>
+              <w:t xml:space="preserve">____</w:t>
+            </w:r>
+          </w:p>
+        </w:tc>
+        <w:tc>
+          <w:tcPr>
+            <w:tcW w:type="dxa" w:w="2000"/>
+            <w:tcBorders>
+              <w:top w:val="single" w:color="808080" w:sz="4"/>
+              <w:left w:val="single" w:color="808080" w:sz="4"/>
+              <w:bottom w:val="single" w:color="808080" w:sz="4"/>
+              <w:right w:val="single" w:color="808080" w:sz="4"/>
+            </w:tcBorders>
+            <w:tcMar>
+              <w:top w:type="dxa" w:w="60"/>
+              <w:left w:type="dxa" w:w="100"/>
+              <w:bottom w:type="dxa" w:w="60"/>
+              <w:right w:type="dxa" w:w="100"/>
+            </w:tcMar>
+          </w:tcPr>
+          <w:p>
+            <w:pPr>
+              <w:spacing w:after="40"/>
+            </w:pPr>
+            <w:r>
+              <w:rPr>
+                <w:rFonts w:ascii="Calibri" w:cs="Calibri" w:eastAsia="Calibri" w:hAnsi="Calibri"/>
+                <w:sz w:val="20"/>
+                <w:szCs w:val="20"/>
+              </w:rPr>
+              <w:t xml:space="preserve">____</w:t>
+            </w:r>
+          </w:p>
+        </w:tc>
+      </w:tr>
+      <w:tr>
+        <w:trPr>
+          <w:cantSplit/>
+          <w:tblHeader w:val="off"/>
+        </w:trPr>
+        <w:tc>
+          <w:tcPr>
+            <w:tcW w:type="dxa" w:w="700"/>
+            <w:tcBorders>
+              <w:top w:val="single" w:color="808080" w:sz="4"/>
+              <w:left w:val="single" w:color="808080" w:sz="4"/>
+              <w:bottom w:val="single" w:color="808080" w:sz="4"/>
+              <w:right w:val="single" w:color="808080" w:sz="4"/>
+            </w:tcBorders>
+            <w:tcMar>
+              <w:top w:type="dxa" w:w="60"/>
+              <w:left w:type="dxa" w:w="100"/>
+              <w:bottom w:type="dxa" w:w="60"/>
+              <w:right w:type="dxa" w:w="100"/>
+            </w:tcMar>
+          </w:tcPr>
+          <w:p>
+            <w:pPr>
+              <w:spacing w:after="40"/>
+            </w:pPr>
+            <w:r>
+              <w:rPr>
+                <w:rFonts w:ascii="Calibri" w:cs="Calibri" w:eastAsia="Calibri" w:hAnsi="Calibri"/>
+                <w:sz w:val="20"/>
+                <w:szCs w:val="20"/>
+              </w:rPr>
+              <w:t xml:space="preserve">10</w:t>
+            </w:r>
+          </w:p>
+        </w:tc>
+        <w:tc>
+          <w:tcPr>
+            <w:tcW w:type="dxa" w:w="4766"/>
+            <w:tcBorders>
+              <w:top w:val="single" w:color="808080" w:sz="4"/>
+              <w:left w:val="single" w:color="808080" w:sz="4"/>
+              <w:bottom w:val="single" w:color="808080" w:sz="4"/>
+              <w:right w:val="single" w:color="808080" w:sz="4"/>
+            </w:tcBorders>
+            <w:tcMar>
+              <w:top w:type="dxa" w:w="60"/>
+              <w:left w:type="dxa" w:w="100"/>
+              <w:bottom w:type="dxa" w:w="60"/>
+              <w:right w:type="dxa" w:w="100"/>
+            </w:tcMar>
+          </w:tcPr>
+          <w:p>
+            <w:pPr>
+              <w:spacing w:after="40"/>
+            </w:pPr>
+            <w:r>
+              <w:rPr>
+                <w:rFonts w:ascii="Calibri" w:cs="Calibri" w:eastAsia="Calibri" w:hAnsi="Calibri"/>
+                <w:sz w:val="20"/>
+                <w:szCs w:val="20"/>
+              </w:rPr>
+              <w:t xml:space="preserve">One-to-Many Relationship</w:t>
+            </w:r>
+          </w:p>
+        </w:tc>
+        <w:tc>
+          <w:tcPr>
+            <w:tcW w:type="dxa" w:w="1300"/>
+            <w:tcBorders>
+              <w:top w:val="single" w:color="808080" w:sz="4"/>
+              <w:left w:val="single" w:color="808080" w:sz="4"/>
+              <w:bottom w:val="single" w:color="808080" w:sz="4"/>
+              <w:right w:val="single" w:color="808080" w:sz="4"/>
+            </w:tcBorders>
+            <w:tcMar>
+              <w:top w:type="dxa" w:w="60"/>
+              <w:left w:type="dxa" w:w="100"/>
+              <w:bottom w:type="dxa" w:w="60"/>
+              <w:right w:type="dxa" w:w="100"/>
+            </w:tcMar>
+          </w:tcPr>
+          <w:p>
+            <w:pPr>
+              <w:spacing w:after="40"/>
+            </w:pPr>
+            <w:r>
+              <w:rPr>
+                <w:rFonts w:ascii="Calibri" w:cs="Calibri" w:eastAsia="Calibri" w:hAnsi="Calibri"/>
+                <w:sz w:val="20"/>
+                <w:szCs w:val="20"/>
+              </w:rPr>
+              <w:t xml:space="preserve">4</w:t>
+            </w:r>
+          </w:p>
+        </w:tc>
+        <w:tc>
+          <w:tcPr>
+            <w:tcW w:type="dxa" w:w="1700"/>
+            <w:tcBorders>
+              <w:top w:val="single" w:color="808080" w:sz="4"/>
+              <w:left w:val="single" w:color="808080" w:sz="4"/>
+              <w:bottom w:val="single" w:color="808080" w:sz="4"/>
+              <w:right w:val="single" w:color="808080" w:sz="4"/>
+            </w:tcBorders>
+            <w:tcMar>
+              <w:top w:type="dxa" w:w="60"/>
+              <w:left w:type="dxa" w:w="100"/>
+              <w:bottom w:type="dxa" w:w="60"/>
+              <w:right w:type="dxa" w:w="100"/>
+            </w:tcMar>
+          </w:tcPr>
+          <w:p>
+            <w:pPr>
+              <w:spacing w:after="40"/>
+            </w:pPr>
+            <w:r>
+              <w:rPr>
+                <w:rFonts w:ascii="Calibri" w:cs="Calibri" w:eastAsia="Calibri" w:hAnsi="Calibri"/>
+                <w:sz w:val="20"/>
+                <w:szCs w:val="20"/>
+              </w:rPr>
+              <w:t xml:space="preserve">____</w:t>
+            </w:r>
+          </w:p>
+        </w:tc>
+        <w:tc>
+          <w:tcPr>
+            <w:tcW w:type="dxa" w:w="2000"/>
+            <w:tcBorders>
+              <w:top w:val="single" w:color="808080" w:sz="4"/>
+              <w:left w:val="single" w:color="808080" w:sz="4"/>
+              <w:bottom w:val="single" w:color="808080" w:sz="4"/>
+              <w:right w:val="single" w:color="808080" w:sz="4"/>
+            </w:tcBorders>
+            <w:tcMar>
+              <w:top w:type="dxa" w:w="60"/>
+              <w:left w:type="dxa" w:w="100"/>
+              <w:bottom w:type="dxa" w:w="60"/>
+              <w:right w:type="dxa" w:w="100"/>
+            </w:tcMar>
+          </w:tcPr>
+          <w:p>
+            <w:pPr>
+              <w:spacing w:after="40"/>
+            </w:pPr>
+            <w:r>
+              <w:rPr>
+                <w:rFonts w:ascii="Calibri" w:cs="Calibri" w:eastAsia="Calibri" w:hAnsi="Calibri"/>
+                <w:sz w:val="20"/>
+                <w:szCs w:val="20"/>
+              </w:rPr>
+              <w:t xml:space="preserve">____</w:t>
+            </w:r>
+          </w:p>
+        </w:tc>
+      </w:tr>
+      <w:tr>
+        <w:trPr>
+          <w:cantSplit/>
+          <w:tblHeader w:val="off"/>
+        </w:trPr>
+        <w:tc>
+          <w:tcPr>
+            <w:tcW w:type="dxa" w:w="700"/>
+            <w:tcBorders>
+              <w:top w:val="single" w:color="808080" w:sz="4"/>
+              <w:left w:val="single" w:color="808080" w:sz="4"/>
+              <w:bottom w:val="single" w:color="808080" w:sz="4"/>
+              <w:right w:val="single" w:color="808080" w:sz="4"/>
+            </w:tcBorders>
+            <w:tcMar>
+              <w:top w:type="dxa" w:w="60"/>
+              <w:left w:type="dxa" w:w="100"/>
+              <w:bottom w:type="dxa" w:w="60"/>
+              <w:right w:type="dxa" w:w="100"/>
+            </w:tcMar>
+          </w:tcPr>
+          <w:p>
+            <w:pPr>
+              <w:spacing w:after="40"/>
+            </w:pPr>
+            <w:r>
+              <w:rPr>
+                <w:rFonts w:ascii="Calibri" w:cs="Calibri" w:eastAsia="Calibri" w:hAnsi="Calibri"/>
+                <w:sz w:val="20"/>
+                <w:szCs w:val="20"/>
+              </w:rPr>
+              <w:t xml:space="preserve">11</w:t>
+            </w:r>
+          </w:p>
+        </w:tc>
+        <w:tc>
+          <w:tcPr>
+            <w:tcW w:type="dxa" w:w="4766"/>
+            <w:tcBorders>
+              <w:top w:val="single" w:color="808080" w:sz="4"/>
+              <w:left w:val="single" w:color="808080" w:sz="4"/>
+              <w:bottom w:val="single" w:color="808080" w:sz="4"/>
+              <w:right w:val="single" w:color="808080" w:sz="4"/>
+            </w:tcBorders>
+            <w:tcMar>
+              <w:top w:type="dxa" w:w="60"/>
+              <w:left w:type="dxa" w:w="100"/>
+              <w:bottom w:type="dxa" w:w="60"/>
+              <w:right w:type="dxa" w:w="100"/>
+            </w:tcMar>
+          </w:tcPr>
+          <w:p>
+            <w:pPr>
+              <w:spacing w:after="40"/>
+            </w:pPr>
+            <w:r>
+              <w:rPr>
+                <w:rFonts w:ascii="Calibri" w:cs="Calibri" w:eastAsia="Calibri" w:hAnsi="Calibri"/>
+                <w:sz w:val="20"/>
+                <w:szCs w:val="20"/>
+              </w:rPr>
+              <w:t xml:space="preserve">Many-to-Many Relationship</w:t>
+            </w:r>
+          </w:p>
+        </w:tc>
+        <w:tc>
+          <w:tcPr>
+            <w:tcW w:type="dxa" w:w="1300"/>
+            <w:tcBorders>
+              <w:top w:val="single" w:color="808080" w:sz="4"/>
+              <w:left w:val="single" w:color="808080" w:sz="4"/>
+              <w:bottom w:val="single" w:color="808080" w:sz="4"/>
+              <w:right w:val="single" w:color="808080" w:sz="4"/>
+            </w:tcBorders>
+            <w:tcMar>
+              <w:top w:type="dxa" w:w="60"/>
+              <w:left w:type="dxa" w:w="100"/>
+              <w:bottom w:type="dxa" w:w="60"/>
+              <w:right w:type="dxa" w:w="100"/>
+            </w:tcMar>
+          </w:tcPr>
+          <w:p>
+            <w:pPr>
+              <w:spacing w:after="40"/>
+            </w:pPr>
+            <w:r>
+              <w:rPr>
+                <w:rFonts w:ascii="Calibri" w:cs="Calibri" w:eastAsia="Calibri" w:hAnsi="Calibri"/>
+                <w:sz w:val="20"/>
+                <w:szCs w:val="20"/>
+              </w:rPr>
+              <w:t xml:space="preserve">4</w:t>
+            </w:r>
+          </w:p>
+        </w:tc>
+        <w:tc>
+          <w:tcPr>
+            <w:tcW w:type="dxa" w:w="1700"/>
+            <w:tcBorders>
+              <w:top w:val="single" w:color="808080" w:sz="4"/>
+              <w:left w:val="single" w:color="808080" w:sz="4"/>
+              <w:bottom w:val="single" w:color="808080" w:sz="4"/>
+              <w:right w:val="single" w:color="808080" w:sz="4"/>
+            </w:tcBorders>
+            <w:tcMar>
+              <w:top w:type="dxa" w:w="60"/>
+              <w:left w:type="dxa" w:w="100"/>
+              <w:bottom w:type="dxa" w:w="60"/>
+              <w:right w:type="dxa" w:w="100"/>
+            </w:tcMar>
+          </w:tcPr>
+          <w:p>
+            <w:pPr>
+              <w:spacing w:after="40"/>
+            </w:pPr>
+            <w:r>
+              <w:rPr>
+                <w:rFonts w:ascii="Calibri" w:cs="Calibri" w:eastAsia="Calibri" w:hAnsi="Calibri"/>
+                <w:sz w:val="20"/>
+                <w:szCs w:val="20"/>
+              </w:rPr>
+              <w:t xml:space="preserve">____</w:t>
+            </w:r>
+          </w:p>
+        </w:tc>
+        <w:tc>
+          <w:tcPr>
+            <w:tcW w:type="dxa" w:w="2000"/>
+            <w:tcBorders>
+              <w:top w:val="single" w:color="808080" w:sz="4"/>
+              <w:left w:val="single" w:color="808080" w:sz="4"/>
+              <w:bottom w:val="single" w:color="808080" w:sz="4"/>
+              <w:right w:val="single" w:color="808080" w:sz="4"/>
+            </w:tcBorders>
+            <w:tcMar>
+              <w:top w:type="dxa" w:w="60"/>
+              <w:left w:type="dxa" w:w="100"/>
+              <w:bottom w:type="dxa" w:w="60"/>
+              <w:right w:type="dxa" w:w="100"/>
+            </w:tcMar>
+          </w:tcPr>
+          <w:p>
+            <w:pPr>
+              <w:spacing w:after="40"/>
+            </w:pPr>
+            <w:r>
+              <w:rPr>
+                <w:rFonts w:ascii="Calibri" w:cs="Calibri" w:eastAsia="Calibri" w:hAnsi="Calibri"/>
+                <w:sz w:val="20"/>
+                <w:szCs w:val="20"/>
+              </w:rPr>
+              <w:t xml:space="preserve">____</w:t>
+            </w:r>
+          </w:p>
+        </w:tc>
+      </w:tr>
+      <w:tr>
+        <w:trPr>
+          <w:cantSplit/>
+          <w:tblHeader w:val="off"/>
+        </w:trPr>
+        <w:tc>
+          <w:tcPr>
+            <w:tcW w:type="dxa" w:w="700"/>
+            <w:tcBorders>
+              <w:top w:val="single" w:color="808080" w:sz="4"/>
+              <w:left w:val="single" w:color="808080" w:sz="4"/>
+              <w:bottom w:val="single" w:color="808080" w:sz="4"/>
+              <w:right w:val="single" w:color="808080" w:sz="4"/>
+            </w:tcBorders>
+            <w:tcMar>
+              <w:top w:type="dxa" w:w="60"/>
+              <w:left w:type="dxa" w:w="100"/>
+              <w:bottom w:type="dxa" w:w="60"/>
+              <w:right w:type="dxa" w:w="100"/>
+            </w:tcMar>
+          </w:tcPr>
+          <w:p>
+            <w:pPr>
+              <w:spacing w:after="40"/>
+            </w:pPr>
+            <w:r>
+              <w:rPr>
+                <w:rFonts w:ascii="Calibri" w:cs="Calibri" w:eastAsia="Calibri" w:hAnsi="Calibri"/>
+                <w:sz w:val="20"/>
+                <w:szCs w:val="20"/>
+              </w:rPr>
+              <w:t xml:space="preserve">12</w:t>
+            </w:r>
+          </w:p>
+        </w:tc>
+        <w:tc>
+          <w:tcPr>
+            <w:tcW w:type="dxa" w:w="4766"/>
+            <w:tcBorders>
+              <w:top w:val="single" w:color="808080" w:sz="4"/>
+              <w:left w:val="single" w:color="808080" w:sz="4"/>
+              <w:bottom w:val="single" w:color="808080" w:sz="4"/>
+              <w:right w:val="single" w:color="808080" w:sz="4"/>
+            </w:tcBorders>
+            <w:tcMar>
+              <w:top w:type="dxa" w:w="60"/>
+              <w:left w:type="dxa" w:w="100"/>
+              <w:bottom w:type="dxa" w:w="60"/>
+              <w:right w:type="dxa" w:w="100"/>
+            </w:tcMar>
+          </w:tcPr>
+          <w:p>
+            <w:pPr>
+              <w:spacing w:after="40"/>
+            </w:pPr>
+            <w:r>
+              <w:rPr>
+                <w:rFonts w:ascii="Calibri" w:cs="Calibri" w:eastAsia="Calibri" w:hAnsi="Calibri"/>
+                <w:sz w:val="20"/>
+                <w:szCs w:val="20"/>
+              </w:rPr>
+              <w:t xml:space="preserve">Primary Key</w:t>
+            </w:r>
+          </w:p>
+        </w:tc>
+        <w:tc>
+          <w:tcPr>
+            <w:tcW w:type="dxa" w:w="1300"/>
+            <w:tcBorders>
+              <w:top w:val="single" w:color="808080" w:sz="4"/>
+              <w:left w:val="single" w:color="808080" w:sz="4"/>
+              <w:bottom w:val="single" w:color="808080" w:sz="4"/>
+              <w:right w:val="single" w:color="808080" w:sz="4"/>
+            </w:tcBorders>
+            <w:tcMar>
+              <w:top w:type="dxa" w:w="60"/>
+              <w:left w:type="dxa" w:w="100"/>
+              <w:bottom w:type="dxa" w:w="60"/>
+              <w:right w:type="dxa" w:w="100"/>
+            </w:tcMar>
+          </w:tcPr>
+          <w:p>
+            <w:pPr>
+              <w:spacing w:after="40"/>
+            </w:pPr>
+            <w:r>
+              <w:rPr>
+                <w:rFonts w:ascii="Calibri" w:cs="Calibri" w:eastAsia="Calibri" w:hAnsi="Calibri"/>
+                <w:sz w:val="20"/>
+                <w:szCs w:val="20"/>
+              </w:rPr>
+              <w:t xml:space="preserve">5</w:t>
+            </w:r>
+          </w:p>
+        </w:tc>
+        <w:tc>
+          <w:tcPr>
+            <w:tcW w:type="dxa" w:w="1700"/>
+            <w:tcBorders>
+              <w:top w:val="single" w:color="808080" w:sz="4"/>
+              <w:left w:val="single" w:color="808080" w:sz="4"/>
+              <w:bottom w:val="single" w:color="808080" w:sz="4"/>
+              <w:right w:val="single" w:color="808080" w:sz="4"/>
+            </w:tcBorders>
+            <w:tcMar>
+              <w:top w:type="dxa" w:w="60"/>
+              <w:left w:type="dxa" w:w="100"/>
+              <w:bottom w:type="dxa" w:w="60"/>
+              <w:right w:type="dxa" w:w="100"/>
+            </w:tcMar>
+          </w:tcPr>
+          <w:p>
+            <w:pPr>
+              <w:spacing w:after="40"/>
+            </w:pPr>
+            <w:r>
+              <w:rPr>
+                <w:rFonts w:ascii="Calibri" w:cs="Calibri" w:eastAsia="Calibri" w:hAnsi="Calibri"/>
+                <w:sz w:val="20"/>
+                <w:szCs w:val="20"/>
+              </w:rPr>
+              <w:t xml:space="preserve">____</w:t>
+            </w:r>
+          </w:p>
+        </w:tc>
+        <w:tc>
+          <w:tcPr>
+            <w:tcW w:type="dxa" w:w="2000"/>
+            <w:tcBorders>
+              <w:top w:val="single" w:color="808080" w:sz="4"/>
+              <w:left w:val="single" w:color="808080" w:sz="4"/>
+              <w:bottom w:val="single" w:color="808080" w:sz="4"/>
+              <w:right w:val="single" w:color="808080" w:sz="4"/>
+            </w:tcBorders>
+            <w:tcMar>
+              <w:top w:type="dxa" w:w="60"/>
+              <w:left w:type="dxa" w:w="100"/>
+              <w:bottom w:type="dxa" w:w="60"/>
+              <w:right w:type="dxa" w:w="100"/>
+            </w:tcMar>
+          </w:tcPr>
+          <w:p>
+            <w:pPr>
+              <w:spacing w:after="40"/>
+            </w:pPr>
+            <w:r>
+              <w:rPr>
+                <w:rFonts w:ascii="Calibri" w:cs="Calibri" w:eastAsia="Calibri" w:hAnsi="Calibri"/>
+                <w:sz w:val="20"/>
+                <w:szCs w:val="20"/>
+              </w:rPr>
+              <w:t xml:space="preserve">____</w:t>
+            </w:r>
+          </w:p>
+        </w:tc>
+      </w:tr>
+      <w:tr>
+        <w:trPr>
+          <w:cantSplit/>
+          <w:tblHeader w:val="off"/>
+        </w:trPr>
+        <w:tc>
+          <w:tcPr>
+            <w:tcW w:type="dxa" w:w="700"/>
+            <w:tcBorders>
+              <w:top w:val="single" w:color="808080" w:sz="4"/>
+              <w:left w:val="single" w:color="808080" w:sz="4"/>
+              <w:bottom w:val="single" w:color="808080" w:sz="4"/>
+              <w:right w:val="single" w:color="808080" w:sz="4"/>
+            </w:tcBorders>
+            <w:tcMar>
+              <w:top w:type="dxa" w:w="60"/>
+              <w:left w:type="dxa" w:w="100"/>
+              <w:bottom w:type="dxa" w:w="60"/>
+              <w:right w:type="dxa" w:w="100"/>
+            </w:tcMar>
+          </w:tcPr>
+          <w:p>
+            <w:pPr>
+              <w:spacing w:after="40"/>
+            </w:pPr>
+            <w:r>
+              <w:rPr>
+                <w:rFonts w:ascii="Calibri" w:cs="Calibri" w:eastAsia="Calibri" w:hAnsi="Calibri"/>
+                <w:sz w:val="20"/>
+                <w:szCs w:val="20"/>
+              </w:rPr>
+              <w:t xml:space="preserve">13</w:t>
+            </w:r>
+          </w:p>
+        </w:tc>
+        <w:tc>
+          <w:tcPr>
+            <w:tcW w:type="dxa" w:w="4766"/>
+            <w:tcBorders>
+              <w:top w:val="single" w:color="808080" w:sz="4"/>
+              <w:left w:val="single" w:color="808080" w:sz="4"/>
+              <w:bottom w:val="single" w:color="808080" w:sz="4"/>
+              <w:right w:val="single" w:color="808080" w:sz="4"/>
+            </w:tcBorders>
+            <w:tcMar>
+              <w:top w:type="dxa" w:w="60"/>
+              <w:left w:type="dxa" w:w="100"/>
+              <w:bottom w:type="dxa" w:w="60"/>
+              <w:right w:type="dxa" w:w="100"/>
+            </w:tcMar>
+          </w:tcPr>
+          <w:p>
+            <w:pPr>
+              <w:spacing w:after="40"/>
+            </w:pPr>
+            <w:r>
+              <w:rPr>
+                <w:rFonts w:ascii="Calibri" w:cs="Calibri" w:eastAsia="Calibri" w:hAnsi="Calibri"/>
+                <w:sz w:val="20"/>
+                <w:szCs w:val="20"/>
+              </w:rPr>
+              <w:t xml:space="preserve">Foreign Key</w:t>
+            </w:r>
+          </w:p>
+        </w:tc>
+        <w:tc>
+          <w:tcPr>
+            <w:tcW w:type="dxa" w:w="1300"/>
+            <w:tcBorders>
+              <w:top w:val="single" w:color="808080" w:sz="4"/>
+              <w:left w:val="single" w:color="808080" w:sz="4"/>
+              <w:bottom w:val="single" w:color="808080" w:sz="4"/>
+              <w:right w:val="single" w:color="808080" w:sz="4"/>
+            </w:tcBorders>
+            <w:tcMar>
+              <w:top w:type="dxa" w:w="60"/>
+              <w:left w:type="dxa" w:w="100"/>
+              <w:bottom w:type="dxa" w:w="60"/>
+              <w:right w:type="dxa" w:w="100"/>
+            </w:tcMar>
+          </w:tcPr>
+          <w:p>
+            <w:pPr>
+              <w:spacing w:after="40"/>
+            </w:pPr>
+            <w:r>
+              <w:rPr>
+                <w:rFonts w:ascii="Calibri" w:cs="Calibri" w:eastAsia="Calibri" w:hAnsi="Calibri"/>
+                <w:sz w:val="20"/>
+                <w:szCs w:val="20"/>
+              </w:rPr>
+              <w:t xml:space="preserve">5</w:t>
+            </w:r>
+          </w:p>
+        </w:tc>
+        <w:tc>
+          <w:tcPr>
+            <w:tcW w:type="dxa" w:w="1700"/>
+            <w:tcBorders>
+              <w:top w:val="single" w:color="808080" w:sz="4"/>
+              <w:left w:val="single" w:color="808080" w:sz="4"/>
+              <w:bottom w:val="single" w:color="808080" w:sz="4"/>
+              <w:right w:val="single" w:color="808080" w:sz="4"/>
+            </w:tcBorders>
+            <w:tcMar>
+              <w:top w:type="dxa" w:w="60"/>
+              <w:left w:type="dxa" w:w="100"/>
+              <w:bottom w:type="dxa" w:w="60"/>
+              <w:right w:type="dxa" w:w="100"/>
+            </w:tcMar>
+          </w:tcPr>
+          <w:p>
+            <w:pPr>
+              <w:spacing w:after="40"/>
+            </w:pPr>
+            <w:r>
+              <w:rPr>
+                <w:rFonts w:ascii="Calibri" w:cs="Calibri" w:eastAsia="Calibri" w:hAnsi="Calibri"/>
+                <w:sz w:val="20"/>
+                <w:szCs w:val="20"/>
+              </w:rPr>
+              <w:t xml:space="preserve">____</w:t>
+            </w:r>
+          </w:p>
+        </w:tc>
+        <w:tc>
+          <w:tcPr>
+            <w:tcW w:type="dxa" w:w="2000"/>
+            <w:tcBorders>
+              <w:top w:val="single" w:color="808080" w:sz="4"/>
+              <w:left w:val="single" w:color="808080" w:sz="4"/>
+              <w:bottom w:val="single" w:color="808080" w:sz="4"/>
+              <w:right w:val="single" w:color="808080" w:sz="4"/>
+            </w:tcBorders>
+            <w:tcMar>
+              <w:top w:type="dxa" w:w="60"/>
+              <w:left w:type="dxa" w:w="100"/>
+              <w:bottom w:type="dxa" w:w="60"/>
+              <w:right w:type="dxa" w:w="100"/>
+            </w:tcMar>
+          </w:tcPr>
+          <w:p>
+            <w:pPr>
+              <w:spacing w:after="40"/>
+            </w:pPr>
+            <w:r>
+              <w:rPr>
+                <w:rFonts w:ascii="Calibri" w:cs="Calibri" w:eastAsia="Calibri" w:hAnsi="Calibri"/>
+                <w:sz w:val="20"/>
+                <w:szCs w:val="20"/>
+              </w:rPr>
+              <w:t xml:space="preserve">____</w:t>
+            </w:r>
+          </w:p>
+        </w:tc>
+      </w:tr>
+      <w:tr>
+        <w:trPr>
+          <w:cantSplit/>
+          <w:tblHeader w:val="off"/>
+        </w:trPr>
+        <w:tc>
+          <w:tcPr>
+            <w:tcW w:type="dxa" w:w="700"/>
+            <w:tcBorders>
+              <w:top w:val="single" w:color="808080" w:sz="4"/>
+              <w:left w:val="single" w:color="808080" w:sz="4"/>
+              <w:bottom w:val="single" w:color="808080" w:sz="4"/>
+              <w:right w:val="single" w:color="808080" w:sz="4"/>
+            </w:tcBorders>
+            <w:tcMar>
+              <w:top w:type="dxa" w:w="60"/>
+              <w:left w:type="dxa" w:w="100"/>
+              <w:bottom w:type="dxa" w:w="60"/>
+              <w:right w:type="dxa" w:w="100"/>
+            </w:tcMar>
+          </w:tcPr>
+          <w:p>
+            <w:pPr>
+              <w:spacing w:after="40"/>
+            </w:pPr>
+            <w:r>
+              <w:rPr>
+                <w:rFonts w:ascii="Calibri" w:cs="Calibri" w:eastAsia="Calibri" w:hAnsi="Calibri"/>
+                <w:sz w:val="20"/>
+                <w:szCs w:val="20"/>
+              </w:rPr>
+              <w:t xml:space="preserve">14</w:t>
+            </w:r>
+          </w:p>
+        </w:tc>
+        <w:tc>
+          <w:tcPr>
+            <w:tcW w:type="dxa" w:w="4766"/>
+            <w:tcBorders>
+              <w:top w:val="single" w:color="808080" w:sz="4"/>
+              <w:left w:val="single" w:color="808080" w:sz="4"/>
+              <w:bottom w:val="single" w:color="808080" w:sz="4"/>
+              <w:right w:val="single" w:color="808080" w:sz="4"/>
+            </w:tcBorders>
+            <w:tcMar>
+              <w:top w:type="dxa" w:w="60"/>
+              <w:left w:type="dxa" w:w="100"/>
+              <w:bottom w:type="dxa" w:w="60"/>
+              <w:right w:type="dxa" w:w="100"/>
+            </w:tcMar>
+          </w:tcPr>
+          <w:p>
+            <w:pPr>
+              <w:spacing w:after="40"/>
+            </w:pPr>
+            <w:r>
+              <w:rPr>
+                <w:rFonts w:ascii="Calibri" w:cs="Calibri" w:eastAsia="Calibri" w:hAnsi="Calibri"/>
+                <w:sz w:val="20"/>
+                <w:szCs w:val="20"/>
+              </w:rPr>
+              <w:t xml:space="preserve">Weak Entity</w:t>
+            </w:r>
+          </w:p>
+        </w:tc>
+        <w:tc>
+          <w:tcPr>
+            <w:tcW w:type="dxa" w:w="1300"/>
+            <w:tcBorders>
+              <w:top w:val="single" w:color="808080" w:sz="4"/>
+              <w:left w:val="single" w:color="808080" w:sz="4"/>
+              <w:bottom w:val="single" w:color="808080" w:sz="4"/>
+              <w:right w:val="single" w:color="808080" w:sz="4"/>
+            </w:tcBorders>
+            <w:tcMar>
+              <w:top w:type="dxa" w:w="60"/>
+              <w:left w:type="dxa" w:w="100"/>
+              <w:bottom w:type="dxa" w:w="60"/>
+              <w:right w:type="dxa" w:w="100"/>
+            </w:tcMar>
+          </w:tcPr>
+          <w:p>
+            <w:pPr>
+              <w:spacing w:after="40"/>
+            </w:pPr>
+            <w:r>
+              <w:rPr>
+                <w:rFonts w:ascii="Calibri" w:cs="Calibri" w:eastAsia="Calibri" w:hAnsi="Calibri"/>
+                <w:sz w:val="20"/>
+                <w:szCs w:val="20"/>
+              </w:rPr>
+              <w:t xml:space="preserve">4</w:t>
+            </w:r>
+          </w:p>
+        </w:tc>
+        <w:tc>
+          <w:tcPr>
+            <w:tcW w:type="dxa" w:w="1700"/>
+            <w:tcBorders>
+              <w:top w:val="single" w:color="808080" w:sz="4"/>
+              <w:left w:val="single" w:color="808080" w:sz="4"/>
+              <w:bottom w:val="single" w:color="808080" w:sz="4"/>
+              <w:right w:val="single" w:color="808080" w:sz="4"/>
+            </w:tcBorders>
+            <w:tcMar>
+              <w:top w:type="dxa" w:w="60"/>
+              <w:left w:type="dxa" w:w="100"/>
+              <w:bottom w:type="dxa" w:w="60"/>
+              <w:right w:type="dxa" w:w="100"/>
+            </w:tcMar>
+          </w:tcPr>
+          <w:p>
+            <w:pPr>
+              <w:spacing w:after="40"/>
+            </w:pPr>
+            <w:r>
+              <w:rPr>
+                <w:rFonts w:ascii="Calibri" w:cs="Calibri" w:eastAsia="Calibri" w:hAnsi="Calibri"/>
+                <w:sz w:val="20"/>
+                <w:szCs w:val="20"/>
+              </w:rPr>
+              <w:t xml:space="preserve">____</w:t>
+            </w:r>
+          </w:p>
+        </w:tc>
+        <w:tc>
+          <w:tcPr>
+            <w:tcW w:type="dxa" w:w="2000"/>
+            <w:tcBorders>
+              <w:top w:val="single" w:color="808080" w:sz="4"/>
+              <w:left w:val="single" w:color="808080" w:sz="4"/>
+              <w:bottom w:val="single" w:color="808080" w:sz="4"/>
+              <w:right w:val="single" w:color="808080" w:sz="4"/>
+            </w:tcBorders>
+            <w:tcMar>
+              <w:top w:type="dxa" w:w="60"/>
+              <w:left w:type="dxa" w:w="100"/>
+              <w:bottom w:type="dxa" w:w="60"/>
+              <w:right w:type="dxa" w:w="100"/>
+            </w:tcMar>
+          </w:tcPr>
+          <w:p>
+            <w:pPr>
+              <w:spacing w:after="40"/>
+            </w:pPr>
+            <w:r>
+              <w:rPr>
+                <w:rFonts w:ascii="Calibri" w:cs="Calibri" w:eastAsia="Calibri" w:hAnsi="Calibri"/>
+                <w:sz w:val="20"/>
+                <w:szCs w:val="20"/>
+              </w:rPr>
+              <w:t xml:space="preserve">____</w:t>
+            </w:r>
+          </w:p>
+        </w:tc>
+      </w:tr>
+      <w:tr>
+        <w:trPr>
+          <w:cantSplit/>
+          <w:tblHeader w:val="off"/>
+        </w:trPr>
+        <w:tc>
+          <w:tcPr>
+            <w:tcW w:type="dxa" w:w="700"/>
+            <w:tcBorders>
+              <w:top w:val="single" w:color="808080" w:sz="4"/>
+              <w:left w:val="single" w:color="808080" w:sz="4"/>
+              <w:bottom w:val="single" w:color="808080" w:sz="4"/>
+              <w:right w:val="single" w:color="808080" w:sz="4"/>
+            </w:tcBorders>
+            <w:tcMar>
+              <w:top w:type="dxa" w:w="60"/>
+              <w:left w:type="dxa" w:w="100"/>
+              <w:bottom w:type="dxa" w:w="60"/>
+              <w:right w:type="dxa" w:w="100"/>
+            </w:tcMar>
+          </w:tcPr>
+          <w:p>
+            <w:pPr>
+              <w:spacing w:after="40"/>
+            </w:pPr>
+            <w:r>
+              <w:rPr>
+                <w:rFonts w:ascii="Calibri" w:cs="Calibri" w:eastAsia="Calibri" w:hAnsi="Calibri"/>
+                <w:sz w:val="20"/>
+                <w:szCs w:val="20"/>
+              </w:rPr>
+              <w:t xml:space="preserve">15</w:t>
+            </w:r>
+          </w:p>
+        </w:tc>
+        <w:tc>
+          <w:tcPr>
+            <w:tcW w:type="dxa" w:w="4766"/>
+            <w:tcBorders>
+              <w:top w:val="single" w:color="808080" w:sz="4"/>
+              <w:left w:val="single" w:color="808080" w:sz="4"/>
+              <w:bottom w:val="single" w:color="808080" w:sz="4"/>
+              <w:right w:val="single" w:color="808080" w:sz="4"/>
+            </w:tcBorders>
+            <w:tcMar>
+              <w:top w:type="dxa" w:w="60"/>
+              <w:left w:type="dxa" w:w="100"/>
+              <w:bottom w:type="dxa" w:w="60"/>
+              <w:right w:type="dxa" w:w="100"/>
+            </w:tcMar>
+          </w:tcPr>
+          <w:p>
+            <w:pPr>
+              <w:spacing w:after="40"/>
+            </w:pPr>
+            <w:r>
+              <w:rPr>
+                <w:rFonts w:ascii="Calibri" w:cs="Calibri" w:eastAsia="Calibri" w:hAnsi="Calibri"/>
+                <w:sz w:val="20"/>
+                <w:szCs w:val="20"/>
+              </w:rPr>
+              <w:t xml:space="preserve">ER Modelling</w:t>
+            </w:r>
+          </w:p>
+        </w:tc>
+        <w:tc>
+          <w:tcPr>
+            <w:tcW w:type="dxa" w:w="1300"/>
+            <w:tcBorders>
+              <w:top w:val="single" w:color="808080" w:sz="4"/>
+              <w:left w:val="single" w:color="808080" w:sz="4"/>
+              <w:bottom w:val="single" w:color="808080" w:sz="4"/>
+              <w:right w:val="single" w:color="808080" w:sz="4"/>
+            </w:tcBorders>
+            <w:tcMar>
+              <w:top w:type="dxa" w:w="60"/>
+              <w:left w:type="dxa" w:w="100"/>
+              <w:bottom w:type="dxa" w:w="60"/>
+              <w:right w:type="dxa" w:w="100"/>
+            </w:tcMar>
+          </w:tcPr>
+          <w:p>
+            <w:pPr>
+              <w:spacing w:after="40"/>
+            </w:pPr>
+            <w:r>
+              <w:rPr>
+                <w:rFonts w:ascii="Calibri" w:cs="Calibri" w:eastAsia="Calibri" w:hAnsi="Calibri"/>
+                <w:sz w:val="20"/>
+                <w:szCs w:val="20"/>
+              </w:rPr>
+              <w:t xml:space="preserve">4</w:t>
+            </w:r>
+          </w:p>
+        </w:tc>
+        <w:tc>
+          <w:tcPr>
+            <w:tcW w:type="dxa" w:w="1700"/>
+            <w:tcBorders>
+              <w:top w:val="single" w:color="808080" w:sz="4"/>
+              <w:left w:val="single" w:color="808080" w:sz="4"/>
+              <w:bottom w:val="single" w:color="808080" w:sz="4"/>
+              <w:right w:val="single" w:color="808080" w:sz="4"/>
+            </w:tcBorders>
+            <w:tcMar>
+              <w:top w:type="dxa" w:w="60"/>
+              <w:left w:type="dxa" w:w="100"/>
+              <w:bottom w:type="dxa" w:w="60"/>
+              <w:right w:type="dxa" w:w="100"/>
+            </w:tcMar>
+          </w:tcPr>
+          <w:p>
+            <w:pPr>
+              <w:spacing w:after="40"/>
+            </w:pPr>
+            <w:r>
+              <w:rPr>
+                <w:rFonts w:ascii="Calibri" w:cs="Calibri" w:eastAsia="Calibri" w:hAnsi="Calibri"/>
+                <w:sz w:val="20"/>
+                <w:szCs w:val="20"/>
+              </w:rPr>
+              <w:t xml:space="preserve">____</w:t>
+            </w:r>
+          </w:p>
+        </w:tc>
+        <w:tc>
+          <w:tcPr>
+            <w:tcW w:type="dxa" w:w="2000"/>
+            <w:tcBorders>
+              <w:top w:val="single" w:color="808080" w:sz="4"/>
+              <w:left w:val="single" w:color="808080" w:sz="4"/>
+              <w:bottom w:val="single" w:color="808080" w:sz="4"/>
+              <w:right w:val="single" w:color="808080" w:sz="4"/>
+            </w:tcBorders>
+            <w:tcMar>
+              <w:top w:type="dxa" w:w="60"/>
+              <w:left w:type="dxa" w:w="100"/>
+              <w:bottom w:type="dxa" w:w="60"/>
+              <w:right w:type="dxa" w:w="100"/>
+            </w:tcMar>
+          </w:tcPr>
+          <w:p>
+            <w:pPr>
+              <w:spacing w:after="40"/>
+            </w:pPr>
+            <w:r>
+              <w:rPr>
+                <w:rFonts w:ascii="Calibri" w:cs="Calibri" w:eastAsia="Calibri" w:hAnsi="Calibri"/>
+                <w:sz w:val="20"/>
+                <w:szCs w:val="20"/>
+              </w:rPr>
+              <w:t xml:space="preserve">____</w:t>
+            </w:r>
+          </w:p>
+        </w:tc>
+      </w:tr>
+      <w:tr>
+        <w:trPr>
+          <w:cantSplit/>
+          <w:tblHeader w:val="off"/>
+        </w:trPr>
+        <w:tc>
+          <w:tcPr>
+            <w:tcW w:type="dxa" w:w="700"/>
+            <w:tcBorders>
+              <w:top w:val="single" w:color="808080" w:sz="4"/>
+              <w:left w:val="single" w:color="808080" w:sz="4"/>
+              <w:bottom w:val="single" w:color="808080" w:sz="4"/>
+              <w:right w:val="single" w:color="808080" w:sz="4"/>
+            </w:tcBorders>
+            <w:tcMar>
+              <w:top w:type="dxa" w:w="60"/>
+              <w:left w:type="dxa" w:w="100"/>
+              <w:bottom w:type="dxa" w:w="60"/>
+              <w:right w:type="dxa" w:w="100"/>
+            </w:tcMar>
+          </w:tcPr>
+          <w:p>
+            <w:pPr>
+              <w:spacing w:after="40"/>
+            </w:pPr>
+            <w:r>
+              <w:rPr>
+                <w:rFonts w:ascii="Calibri" w:cs="Calibri" w:eastAsia="Calibri" w:hAnsi="Calibri"/>
+                <w:sz w:val="20"/>
+                <w:szCs w:val="20"/>
+              </w:rPr>
+              <w:t xml:space="preserve"/>
+            </w:r>
+          </w:p>
+        </w:tc>
+        <w:tc>
+          <w:tcPr>
+            <w:tcW w:type="dxa" w:w="4766"/>
+            <w:tcBorders>
+              <w:top w:val="single" w:color="808080" w:sz="4"/>
+              <w:left w:val="single" w:color="808080" w:sz="4"/>
+              <w:bottom w:val="single" w:color="808080" w:sz="4"/>
+              <w:right w:val="single" w:color="808080" w:sz="4"/>
+            </w:tcBorders>
+            <w:tcMar>
+              <w:top w:type="dxa" w:w="60"/>
+              <w:left w:type="dxa" w:w="100"/>
+              <w:bottom w:type="dxa" w:w="60"/>
+              <w:right w:type="dxa" w:w="100"/>
+            </w:tcMar>
+          </w:tcPr>
+          <w:p>
+            <w:pPr>
+              <w:spacing w:after="80"/>
+            </w:pPr>
+            <w:r>
+              <w:rPr>
+                <w:rFonts w:ascii="Calibri" w:cs="Calibri" w:eastAsia="Calibri" w:hAnsi="Calibri"/>
+                <w:b/>
+                <w:bCs/>
+                <w:sz w:val="20"/>
+                <w:szCs w:val="20"/>
+              </w:rPr>
+              <w:t xml:space="preserve">Totals</w:t>
+            </w:r>
+          </w:p>
+        </w:tc>
+        <w:tc>
+          <w:tcPr>
+            <w:tcW w:type="dxa" w:w="1300"/>
+            <w:tcBorders>
+              <w:top w:val="single" w:color="808080" w:sz="4"/>
+              <w:left w:val="single" w:color="808080" w:sz="4"/>
+              <w:bottom w:val="single" w:color="808080" w:sz="4"/>
+              <w:right w:val="single" w:color="808080" w:sz="4"/>
+            </w:tcBorders>
+            <w:tcMar>
+              <w:top w:type="dxa" w:w="60"/>
+              <w:left w:type="dxa" w:w="100"/>
+              <w:bottom w:type="dxa" w:w="60"/>
+              <w:right w:type="dxa" w:w="100"/>
+            </w:tcMar>
+          </w:tcPr>
+          <w:p>
+            <w:pPr>
+              <w:spacing w:after="40"/>
+            </w:pPr>
+            <w:r>
+              <w:rPr>
+                <w:rFonts w:ascii="Calibri" w:cs="Calibri" w:eastAsia="Calibri" w:hAnsi="Calibri"/>
+                <w:sz w:val="20"/>
+                <w:szCs w:val="20"/>
+              </w:rPr>
+              <w:t xml:space="preserve">W = 62</w:t>
+            </w:r>
+          </w:p>
+        </w:tc>
+        <w:tc>
+          <w:tcPr>
+            <w:tcW w:type="dxa" w:w="1700"/>
+            <w:tcBorders>
+              <w:top w:val="single" w:color="808080" w:sz="4"/>
+              <w:left w:val="single" w:color="808080" w:sz="4"/>
+              <w:bottom w:val="single" w:color="808080" w:sz="4"/>
+              <w:right w:val="single" w:color="808080" w:sz="4"/>
+            </w:tcBorders>
+            <w:tcMar>
+              <w:top w:type="dxa" w:w="60"/>
+              <w:left w:type="dxa" w:w="100"/>
+              <w:bottom w:type="dxa" w:w="60"/>
+              <w:right w:type="dxa" w:w="100"/>
+            </w:tcMar>
+          </w:tcPr>
+          <w:p>
+            <w:pPr>
+              <w:spacing w:after="40"/>
+            </w:pPr>
+            <w:r>
+              <w:rPr>
+                <w:rFonts w:ascii="Calibri" w:cs="Calibri" w:eastAsia="Calibri" w:hAnsi="Calibri"/>
+                <w:sz w:val="20"/>
+                <w:szCs w:val="20"/>
+              </w:rPr>
+              <w:t xml:space="preserve"/>
+            </w:r>
+          </w:p>
+        </w:tc>
+        <w:tc>
+          <w:tcPr>
+            <w:tcW w:type="dxa" w:w="2000"/>
+            <w:tcBorders>
+              <w:top w:val="single" w:color="808080" w:sz="4"/>
+              <w:left w:val="single" w:color="808080" w:sz="4"/>
+              <w:bottom w:val="single" w:color="808080" w:sz="4"/>
+              <w:right w:val="single" w:color="808080" w:sz="4"/>
+            </w:tcBorders>
+            <w:tcMar>
+              <w:top w:type="dxa" w:w="60"/>
+              <w:left w:type="dxa" w:w="100"/>
+              <w:bottom w:type="dxa" w:w="60"/>
+              <w:right w:type="dxa" w:w="100"/>
+            </w:tcMar>
+          </w:tcPr>
+          <w:p>
+            <w:pPr>
+              <w:spacing w:after="40"/>
+            </w:pPr>
+            <w:r>
+              <w:rPr>
+                <w:rFonts w:ascii="Calibri" w:cs="Calibri" w:eastAsia="Calibri" w:hAnsi="Calibri"/>
+                <w:sz w:val="20"/>
+                <w:szCs w:val="20"/>
+              </w:rPr>
+              <w:t xml:space="preserve">S = ____</w:t>
+            </w:r>
+          </w:p>
+        </w:tc>
+      </w:tr>
+    </w:tbl>
+    <w:p>
+      <w:pPr>
+        <w:spacing w:after="200" w:before="100"/>
+      </w:pPr>
+      <w:r>
+        <w:rPr>
+          <w:rFonts w:ascii="Calibri" w:cs="Calibri" w:eastAsia="Calibri" w:hAnsi="Calibri"/>
+          <w:b/>
+          <w:bCs/>
+          <w:sz w:val="20"/>
+          <w:szCs w:val="20"/>
+        </w:rPr>
+        <w:t xml:space="preserve">Technical mark /10 = S ÷ 62 = ________</w:t>
       </w:r>
     </w:p>
     <w:p>

</xml_diff>